<commit_message>
Texto, Entidade e Regra de Negocios
</commit_message>
<xml_diff>
--- a/UC16/Corpo_Ativo/Regro_Negocios _Entidades.docx
+++ b/UC16/Corpo_Ativo/Regro_Negocios _Entidades.docx
@@ -23,10 +23,12 @@
       <w:pPr>
         <w:pStyle w:val="NormalWeb"/>
         <w:rPr>
-          <w:rFonts w:ascii="Consolas" w:eastAsia="Times New Roman" w:hAnsi="Consolas" w:cs="Arial"/>
-          <w:sz w:val="22"/>
-          <w:szCs w:val="22"/>
-          <w:lang w:eastAsia="pt-BR"/>
+          <w:rFonts w:eastAsia="Times New Roman"/>
+          <w:kern w:val="0"/>
+          <w:sz w:val="22"/>
+          <w:szCs w:val="22"/>
+          <w:lang w:eastAsia="pt-BR"/>
+          <w14:ligatures w14:val="none"/>
         </w:rPr>
       </w:pPr>
       <w:r>
@@ -50,244 +52,1624 @@
           <w:lang w:eastAsia="pt-BR"/>
           <w14:ligatures w14:val="none"/>
         </w:rPr>
-        <w:t>O "Corpo Ativo" é uma academia de bairro</w:t>
-      </w:r>
-      <w:r>
-        <w:rPr>
-          <w:rFonts w:eastAsia="Times New Roman"/>
-          <w:kern w:val="0"/>
-          <w:sz w:val="22"/>
-          <w:szCs w:val="22"/>
-          <w:lang w:eastAsia="pt-BR"/>
-          <w14:ligatures w14:val="none"/>
-        </w:rPr>
-        <w:t>.</w:t>
-      </w:r>
-    </w:p>
-    <w:p>
-      <w:pPr>
-        <w:pStyle w:val="NormalWeb"/>
-        <w:ind w:firstLine="708"/>
-        <w:rPr>
-          <w:rFonts w:ascii="Consolas" w:eastAsia="Times New Roman" w:hAnsi="Consolas" w:cs="Arial"/>
-          <w:sz w:val="22"/>
-          <w:szCs w:val="22"/>
-          <w:lang w:eastAsia="pt-BR"/>
-        </w:rPr>
-      </w:pPr>
-      <w:r>
-        <w:rPr>
-          <w:rFonts w:eastAsia="Times New Roman"/>
-          <w:sz w:val="22"/>
-          <w:szCs w:val="22"/>
-          <w:lang w:eastAsia="pt-BR"/>
-        </w:rPr>
-        <w:t xml:space="preserve">O horário de funcionamento é das 6 </w:t>
-      </w:r>
-      <w:proofErr w:type="gramStart"/>
-      <w:r>
-        <w:rPr>
-          <w:rFonts w:eastAsia="Times New Roman"/>
-          <w:sz w:val="22"/>
-          <w:szCs w:val="22"/>
-          <w:lang w:eastAsia="pt-BR"/>
-        </w:rPr>
-        <w:t>ás</w:t>
-      </w:r>
-      <w:proofErr w:type="gramEnd"/>
-      <w:r>
-        <w:rPr>
-          <w:rFonts w:eastAsia="Times New Roman"/>
-          <w:sz w:val="22"/>
-          <w:szCs w:val="22"/>
-          <w:lang w:eastAsia="pt-BR"/>
-        </w:rPr>
-        <w:t xml:space="preserve"> 22h segunda à sábado e de domingo é 10h às 22h.</w:t>
-      </w:r>
-    </w:p>
-    <w:p>
-      <w:pPr>
-        <w:pStyle w:val="NormalWeb"/>
-        <w:rPr>
-          <w:rFonts w:ascii="Consolas" w:eastAsia="Times New Roman" w:hAnsi="Consolas" w:cs="Arial"/>
-          <w:sz w:val="22"/>
-          <w:szCs w:val="22"/>
-          <w:lang w:eastAsia="pt-BR"/>
-        </w:rPr>
-      </w:pPr>
-      <w:r>
-        <w:rPr>
-          <w:rFonts w:eastAsia="Times New Roman"/>
-          <w:kern w:val="0"/>
-          <w:sz w:val="22"/>
-          <w:szCs w:val="22"/>
-          <w:lang w:eastAsia="pt-BR"/>
-          <w14:ligatures w14:val="none"/>
-        </w:rPr>
-        <w:t>P</w:t>
-      </w:r>
-      <w:r>
-        <w:rPr>
-          <w:rFonts w:eastAsia="Times New Roman"/>
-          <w:kern w:val="0"/>
-          <w:sz w:val="22"/>
-          <w:szCs w:val="22"/>
-          <w:lang w:eastAsia="pt-BR"/>
-          <w14:ligatures w14:val="none"/>
-        </w:rPr>
-        <w:t>lanos (ouro, prata e bronze). Cada plano oferece diferentes tipos de modalidades</w:t>
-      </w:r>
-      <w:r>
-        <w:rPr>
-          <w:rFonts w:eastAsia="Times New Roman"/>
-          <w:kern w:val="0"/>
-          <w:sz w:val="22"/>
-          <w:szCs w:val="22"/>
-          <w:lang w:eastAsia="pt-BR"/>
-          <w14:ligatures w14:val="none"/>
-        </w:rPr>
-        <w:t>.</w:t>
-      </w:r>
-    </w:p>
-    <w:p>
-      <w:pPr>
-        <w:pStyle w:val="NormalWeb"/>
-        <w:ind w:firstLine="708"/>
-        <w:rPr>
-          <w:rFonts w:ascii="Consolas" w:eastAsia="Times New Roman" w:hAnsi="Consolas" w:cs="Arial"/>
-          <w:sz w:val="22"/>
-          <w:szCs w:val="22"/>
-          <w:lang w:eastAsia="pt-BR"/>
-        </w:rPr>
-      </w:pPr>
-      <w:r>
-        <w:rPr>
-          <w:rFonts w:eastAsia="Times New Roman"/>
-          <w:sz w:val="22"/>
-          <w:szCs w:val="22"/>
-          <w:lang w:eastAsia="pt-BR"/>
-        </w:rPr>
-        <w:t>- Os planos Gold e prata serão planos de um ano, caso adaptação, a academia irá oferecer 7 dias grátis, podendo ter os planos de mensal (Bronze) ou anual (Ouro e Prata).</w:t>
-      </w:r>
-    </w:p>
-    <w:p>
-      <w:pPr>
-        <w:pStyle w:val="NormalWeb"/>
-        <w:ind w:firstLine="708"/>
-        <w:rPr>
-          <w:rFonts w:ascii="Consolas" w:eastAsia="Times New Roman" w:hAnsi="Consolas" w:cs="Arial"/>
-          <w:sz w:val="22"/>
-          <w:szCs w:val="22"/>
-          <w:lang w:eastAsia="pt-BR"/>
-        </w:rPr>
-      </w:pPr>
-      <w:r>
-        <w:rPr>
-          <w:rFonts w:eastAsia="Times New Roman"/>
-          <w:kern w:val="0"/>
-          <w:sz w:val="22"/>
-          <w:szCs w:val="22"/>
-          <w:lang w:eastAsia="pt-BR"/>
-          <w14:ligatures w14:val="none"/>
-        </w:rPr>
-        <w:t>-</w:t>
-      </w:r>
-      <w:r>
-        <w:rPr>
-          <w:rFonts w:eastAsia="Times New Roman"/>
-          <w:kern w:val="0"/>
-          <w:sz w:val="22"/>
-          <w:szCs w:val="22"/>
-          <w:lang w:eastAsia="pt-BR"/>
-          <w14:ligatures w14:val="none"/>
-        </w:rPr>
-        <w:t xml:space="preserve"> Gold contendo todas as modalidades e um professor particular, tendo a opção de agenda um horário exclusivo. </w:t>
-      </w:r>
-    </w:p>
-    <w:p>
-      <w:pPr>
-        <w:pStyle w:val="NormalWeb"/>
-        <w:ind w:firstLine="708"/>
-        <w:rPr>
-          <w:rFonts w:eastAsia="Times New Roman"/>
-          <w:sz w:val="22"/>
-          <w:szCs w:val="22"/>
-          <w:lang w:eastAsia="pt-BR"/>
-        </w:rPr>
-      </w:pPr>
-      <w:r>
-        <w:rPr>
-          <w:rFonts w:eastAsia="Times New Roman"/>
-          <w:sz w:val="22"/>
-          <w:szCs w:val="22"/>
-          <w:lang w:eastAsia="pt-BR"/>
-        </w:rPr>
-        <w:t xml:space="preserve">- </w:t>
-      </w:r>
-      <w:proofErr w:type="gramStart"/>
-      <w:r>
-        <w:rPr>
-          <w:rFonts w:eastAsia="Times New Roman"/>
-          <w:sz w:val="22"/>
-          <w:szCs w:val="22"/>
-          <w:lang w:eastAsia="pt-BR"/>
-        </w:rPr>
-        <w:t>Prata ??</w:t>
-      </w:r>
-      <w:proofErr w:type="gramEnd"/>
-    </w:p>
-    <w:p>
-      <w:pPr>
-        <w:pStyle w:val="NormalWeb"/>
-        <w:ind w:firstLine="708"/>
-        <w:rPr>
-          <w:rFonts w:eastAsia="Times New Roman"/>
-          <w:sz w:val="22"/>
-          <w:szCs w:val="22"/>
-          <w:lang w:eastAsia="pt-BR"/>
-        </w:rPr>
-      </w:pPr>
-      <w:r>
-        <w:rPr>
-          <w:rFonts w:eastAsia="Times New Roman"/>
-          <w:sz w:val="22"/>
-          <w:szCs w:val="22"/>
-          <w:lang w:eastAsia="pt-BR"/>
-        </w:rPr>
-        <w:t xml:space="preserve">- </w:t>
-      </w:r>
-      <w:proofErr w:type="gramStart"/>
-      <w:r>
-        <w:rPr>
-          <w:rFonts w:eastAsia="Times New Roman"/>
-          <w:sz w:val="22"/>
-          <w:szCs w:val="22"/>
-          <w:lang w:eastAsia="pt-BR"/>
-        </w:rPr>
-        <w:t>Bronze ??</w:t>
-      </w:r>
-      <w:proofErr w:type="gramEnd"/>
-    </w:p>
-    <w:p>
-      <w:pPr>
-        <w:pStyle w:val="NormalWeb"/>
-        <w:rPr>
-          <w:rFonts w:eastAsia="Times New Roman"/>
-          <w:sz w:val="22"/>
-          <w:szCs w:val="22"/>
-          <w:lang w:eastAsia="pt-BR"/>
-        </w:rPr>
-      </w:pPr>
-      <w:r>
-        <w:rPr>
-          <w:rFonts w:eastAsia="Times New Roman"/>
-          <w:kern w:val="0"/>
-          <w:sz w:val="22"/>
-          <w:szCs w:val="22"/>
-          <w:lang w:eastAsia="pt-BR"/>
-          <w14:ligatures w14:val="none"/>
-        </w:rPr>
-        <w:t>Como será feito o cadastro de usuários (Clientes?)</w:t>
+        <w:t>Contexto</w:t>
+      </w:r>
+    </w:p>
+    <w:p>
+      <w:pPr>
+        <w:pStyle w:val="NormalWeb"/>
+        <w:rPr>
+          <w:rFonts w:eastAsia="Times New Roman"/>
+          <w:kern w:val="0"/>
+          <w:sz w:val="22"/>
+          <w:szCs w:val="22"/>
+          <w:lang w:eastAsia="pt-BR"/>
+          <w14:ligatures w14:val="none"/>
+        </w:rPr>
+      </w:pPr>
+      <w:r>
+        <w:rPr>
+          <w:rFonts w:eastAsia="Times New Roman"/>
+          <w:kern w:val="0"/>
+          <w:sz w:val="22"/>
+          <w:szCs w:val="22"/>
+          <w:lang w:eastAsia="pt-BR"/>
+          <w14:ligatures w14:val="none"/>
+        </w:rPr>
+        <w:t>A academia Corpo Ativo, tem o seu horário de funcionamento:</w:t>
+      </w:r>
+    </w:p>
+    <w:p>
+      <w:pPr>
+        <w:pStyle w:val="NormalWeb"/>
+        <w:rPr>
+          <w:rFonts w:eastAsia="Times New Roman"/>
+          <w:kern w:val="0"/>
+          <w:sz w:val="22"/>
+          <w:szCs w:val="22"/>
+          <w:lang w:eastAsia="pt-BR"/>
+          <w14:ligatures w14:val="none"/>
+        </w:rPr>
+      </w:pPr>
+      <w:r>
+        <w:rPr>
+          <w:rFonts w:eastAsia="Times New Roman"/>
+          <w:kern w:val="0"/>
+          <w:sz w:val="22"/>
+          <w:szCs w:val="22"/>
+          <w:lang w:eastAsia="pt-BR"/>
+          <w14:ligatures w14:val="none"/>
+        </w:rPr>
+        <w:t>Segunda a Sábado: 6h às 22h.</w:t>
+      </w:r>
+    </w:p>
+    <w:p>
+      <w:pPr>
+        <w:pStyle w:val="NormalWeb"/>
+        <w:rPr>
+          <w:rFonts w:eastAsia="Times New Roman"/>
+          <w:kern w:val="0"/>
+          <w:sz w:val="22"/>
+          <w:szCs w:val="22"/>
+          <w:lang w:eastAsia="pt-BR"/>
+          <w14:ligatures w14:val="none"/>
+        </w:rPr>
+      </w:pPr>
+      <w:r>
+        <w:rPr>
+          <w:rFonts w:eastAsia="Times New Roman"/>
+          <w:kern w:val="0"/>
+          <w:sz w:val="22"/>
+          <w:szCs w:val="22"/>
+          <w:lang w:eastAsia="pt-BR"/>
+          <w14:ligatures w14:val="none"/>
+        </w:rPr>
+        <w:t>Domingo: das 8h às 16h.</w:t>
+      </w:r>
+    </w:p>
+    <w:p>
+      <w:pPr>
+        <w:pStyle w:val="NormalWeb"/>
+        <w:rPr>
+          <w:rFonts w:eastAsia="Times New Roman"/>
+          <w:kern w:val="0"/>
+          <w:sz w:val="22"/>
+          <w:szCs w:val="22"/>
+          <w:lang w:eastAsia="pt-BR"/>
+          <w14:ligatures w14:val="none"/>
+        </w:rPr>
+      </w:pPr>
+      <w:r>
+        <w:rPr>
+          <w:rFonts w:eastAsia="Times New Roman"/>
+          <w:kern w:val="0"/>
+          <w:sz w:val="22"/>
+          <w:szCs w:val="22"/>
+          <w:lang w:eastAsia="pt-BR"/>
+          <w14:ligatures w14:val="none"/>
+        </w:rPr>
+        <w:t xml:space="preserve">Ele oferece planos bronze, prata e ouro, cada qual com </w:t>
+      </w:r>
+      <w:proofErr w:type="spellStart"/>
+      <w:r>
+        <w:rPr>
+          <w:rFonts w:eastAsia="Times New Roman"/>
+          <w:kern w:val="0"/>
+          <w:sz w:val="22"/>
+          <w:szCs w:val="22"/>
+          <w:lang w:eastAsia="pt-BR"/>
+          <w14:ligatures w14:val="none"/>
+        </w:rPr>
+        <w:t>sua</w:t>
+      </w:r>
+      <w:proofErr w:type="spellEnd"/>
+      <w:r>
+        <w:rPr>
+          <w:rFonts w:eastAsia="Times New Roman"/>
+          <w:kern w:val="0"/>
+          <w:sz w:val="22"/>
+          <w:szCs w:val="22"/>
+          <w:lang w:eastAsia="pt-BR"/>
+          <w14:ligatures w14:val="none"/>
+        </w:rPr>
+        <w:t xml:space="preserve"> particularidades, alguns contendo mais modalidades do que outros.</w:t>
+      </w:r>
+    </w:p>
+    <w:p>
+      <w:pPr>
+        <w:pStyle w:val="NormalWeb"/>
+        <w:rPr>
+          <w:rFonts w:eastAsia="Times New Roman"/>
+          <w:kern w:val="0"/>
+          <w:sz w:val="22"/>
+          <w:szCs w:val="22"/>
+          <w:lang w:eastAsia="pt-BR"/>
+          <w14:ligatures w14:val="none"/>
+        </w:rPr>
+      </w:pPr>
+      <w:r>
+        <w:rPr>
+          <w:rFonts w:eastAsia="Times New Roman"/>
+          <w:kern w:val="0"/>
+          <w:sz w:val="22"/>
+          <w:szCs w:val="22"/>
+          <w:lang w:eastAsia="pt-BR"/>
+          <w14:ligatures w14:val="none"/>
+        </w:rPr>
+        <w:t>Texto:</w:t>
+      </w:r>
+    </w:p>
+    <w:p>
+      <w:pPr>
+        <w:pStyle w:val="NormalWeb"/>
+        <w:rPr>
+          <w:rFonts w:eastAsia="Times New Roman"/>
+          <w:kern w:val="0"/>
+          <w:sz w:val="22"/>
+          <w:szCs w:val="22"/>
+          <w:lang w:eastAsia="pt-BR"/>
+          <w14:ligatures w14:val="none"/>
+        </w:rPr>
+      </w:pPr>
+      <w:r>
+        <w:rPr>
+          <w:rFonts w:eastAsia="Times New Roman"/>
+          <w:kern w:val="0"/>
+          <w:sz w:val="22"/>
+          <w:szCs w:val="22"/>
+          <w:lang w:eastAsia="pt-BR"/>
+          <w14:ligatures w14:val="none"/>
+        </w:rPr>
+        <w:t>O Corpo Ativo é uma academia de bairro que opera de segunda a sábado, das 6h às 22h, e aos domingos, das 10h às 22h. A academia disponibiliza três planos principais: Ouro, Prata e Bronze.</w:t>
+      </w:r>
+    </w:p>
+    <w:p>
+      <w:pPr>
+        <w:pStyle w:val="NormalWeb"/>
+        <w:rPr>
+          <w:rFonts w:eastAsia="Times New Roman"/>
+          <w:kern w:val="0"/>
+          <w:sz w:val="22"/>
+          <w:szCs w:val="22"/>
+          <w:lang w:eastAsia="pt-BR"/>
+          <w14:ligatures w14:val="none"/>
+        </w:rPr>
+      </w:pPr>
+      <w:r>
+        <w:rPr>
+          <w:rFonts w:eastAsia="Times New Roman"/>
+          <w:kern w:val="0"/>
+          <w:sz w:val="22"/>
+          <w:szCs w:val="22"/>
+          <w:lang w:eastAsia="pt-BR"/>
+          <w14:ligatures w14:val="none"/>
+        </w:rPr>
+        <w:t> </w:t>
+      </w:r>
+    </w:p>
+    <w:p>
+      <w:pPr>
+        <w:pStyle w:val="NormalWeb"/>
+        <w:rPr>
+          <w:rFonts w:eastAsia="Times New Roman"/>
+          <w:kern w:val="0"/>
+          <w:sz w:val="22"/>
+          <w:szCs w:val="22"/>
+          <w:lang w:eastAsia="pt-BR"/>
+          <w14:ligatures w14:val="none"/>
+        </w:rPr>
+      </w:pPr>
+      <w:r>
+        <w:rPr>
+          <w:rFonts w:eastAsia="Times New Roman"/>
+          <w:kern w:val="0"/>
+          <w:sz w:val="22"/>
+          <w:szCs w:val="22"/>
+          <w:lang w:eastAsia="pt-BR"/>
+          <w14:ligatures w14:val="none"/>
+        </w:rPr>
+        <w:t xml:space="preserve">O Plano Bronze é mensal e oferece acesso à musculação. O Plano Prata, com validade anual, abrange todas as opções do Plano Bronze, além de atividades coletivas como </w:t>
+      </w:r>
+      <w:proofErr w:type="spellStart"/>
+      <w:r>
+        <w:rPr>
+          <w:rFonts w:eastAsia="Times New Roman"/>
+          <w:kern w:val="0"/>
+          <w:sz w:val="22"/>
+          <w:szCs w:val="22"/>
+          <w:lang w:eastAsia="pt-BR"/>
+          <w14:ligatures w14:val="none"/>
+        </w:rPr>
+        <w:t>spinning</w:t>
+      </w:r>
+      <w:proofErr w:type="spellEnd"/>
+      <w:r>
+        <w:rPr>
+          <w:rFonts w:eastAsia="Times New Roman"/>
+          <w:kern w:val="0"/>
+          <w:sz w:val="22"/>
+          <w:szCs w:val="22"/>
+          <w:lang w:eastAsia="pt-BR"/>
+          <w14:ligatures w14:val="none"/>
+        </w:rPr>
+        <w:t xml:space="preserve">, </w:t>
+      </w:r>
+      <w:proofErr w:type="spellStart"/>
+      <w:r>
+        <w:rPr>
+          <w:rFonts w:eastAsia="Times New Roman"/>
+          <w:kern w:val="0"/>
+          <w:sz w:val="22"/>
+          <w:szCs w:val="22"/>
+          <w:lang w:eastAsia="pt-BR"/>
+          <w14:ligatures w14:val="none"/>
+        </w:rPr>
+        <w:t>pilates</w:t>
+      </w:r>
+      <w:proofErr w:type="spellEnd"/>
+      <w:r>
+        <w:rPr>
+          <w:rFonts w:eastAsia="Times New Roman"/>
+          <w:kern w:val="0"/>
+          <w:sz w:val="22"/>
+          <w:szCs w:val="22"/>
+          <w:lang w:eastAsia="pt-BR"/>
+          <w14:ligatures w14:val="none"/>
+        </w:rPr>
+        <w:t xml:space="preserve"> solo, jump e hidroginástica. Por outro lado, o Plano Ouro é o mais abrangente: com todas as modalidades da academia (musculação, aulas em grupo, </w:t>
+      </w:r>
+      <w:proofErr w:type="spellStart"/>
+      <w:r>
+        <w:rPr>
+          <w:rFonts w:eastAsia="Times New Roman"/>
+          <w:kern w:val="0"/>
+          <w:sz w:val="22"/>
+          <w:szCs w:val="22"/>
+          <w:lang w:eastAsia="pt-BR"/>
+          <w14:ligatures w14:val="none"/>
+        </w:rPr>
+        <w:t>cross</w:t>
+      </w:r>
+      <w:proofErr w:type="spellEnd"/>
+      <w:r>
+        <w:rPr>
+          <w:rFonts w:eastAsia="Times New Roman"/>
+          <w:kern w:val="0"/>
+          <w:sz w:val="22"/>
+          <w:szCs w:val="22"/>
+          <w:lang w:eastAsia="pt-BR"/>
+          <w14:ligatures w14:val="none"/>
+        </w:rPr>
+        <w:t xml:space="preserve"> training, </w:t>
+      </w:r>
+      <w:proofErr w:type="spellStart"/>
+      <w:r>
+        <w:rPr>
+          <w:rFonts w:eastAsia="Times New Roman"/>
+          <w:kern w:val="0"/>
+          <w:sz w:val="22"/>
+          <w:szCs w:val="22"/>
+          <w:lang w:eastAsia="pt-BR"/>
+          <w14:ligatures w14:val="none"/>
+        </w:rPr>
+        <w:t>pilates</w:t>
+      </w:r>
+      <w:proofErr w:type="spellEnd"/>
+      <w:r>
+        <w:rPr>
+          <w:rFonts w:eastAsia="Times New Roman"/>
+          <w:kern w:val="0"/>
+          <w:sz w:val="22"/>
+          <w:szCs w:val="22"/>
+          <w:lang w:eastAsia="pt-BR"/>
+          <w14:ligatures w14:val="none"/>
+        </w:rPr>
+        <w:t xml:space="preserve"> completo, dança, artes marciais e natação), além de contar com um professor particular, com a possibilidade de agendamento exclusivo.</w:t>
+      </w:r>
+    </w:p>
+    <w:p>
+      <w:pPr>
+        <w:pStyle w:val="NormalWeb"/>
+        <w:rPr>
+          <w:rFonts w:eastAsia="Times New Roman"/>
+          <w:kern w:val="0"/>
+          <w:sz w:val="22"/>
+          <w:szCs w:val="22"/>
+          <w:lang w:eastAsia="pt-BR"/>
+          <w14:ligatures w14:val="none"/>
+        </w:rPr>
+      </w:pPr>
+      <w:r>
+        <w:rPr>
+          <w:rFonts w:eastAsia="Times New Roman"/>
+          <w:kern w:val="0"/>
+          <w:sz w:val="22"/>
+          <w:szCs w:val="22"/>
+          <w:lang w:eastAsia="pt-BR"/>
+          <w14:ligatures w14:val="none"/>
+        </w:rPr>
+        <w:t> </w:t>
+      </w:r>
+    </w:p>
+    <w:p>
+      <w:pPr>
+        <w:pStyle w:val="NormalWeb"/>
+        <w:rPr>
+          <w:rFonts w:eastAsia="Times New Roman"/>
+          <w:kern w:val="0"/>
+          <w:sz w:val="22"/>
+          <w:szCs w:val="22"/>
+          <w:lang w:eastAsia="pt-BR"/>
+          <w14:ligatures w14:val="none"/>
+        </w:rPr>
+      </w:pPr>
+      <w:r>
+        <w:rPr>
+          <w:rFonts w:eastAsia="Times New Roman"/>
+          <w:kern w:val="0"/>
+          <w:sz w:val="22"/>
+          <w:szCs w:val="22"/>
+          <w:lang w:eastAsia="pt-BR"/>
+          <w14:ligatures w14:val="none"/>
+        </w:rPr>
+        <w:t>Clientes têm a oportunidade de experimentar a academia sem custo por até 7 dias. Para cancelamentos, é preciso notificar com 30 dias após a renovação; caso contrário, será aplicada uma multa de 30% do valor restante do plano.</w:t>
+      </w:r>
+    </w:p>
+    <w:p>
+      <w:pPr>
+        <w:pStyle w:val="NormalWeb"/>
+        <w:rPr>
+          <w:rFonts w:eastAsia="Times New Roman"/>
+          <w:kern w:val="0"/>
+          <w:sz w:val="22"/>
+          <w:szCs w:val="22"/>
+          <w:lang w:eastAsia="pt-BR"/>
+          <w14:ligatures w14:val="none"/>
+        </w:rPr>
+      </w:pPr>
+      <w:r>
+        <w:rPr>
+          <w:rFonts w:eastAsia="Times New Roman"/>
+          <w:kern w:val="0"/>
+          <w:sz w:val="22"/>
+          <w:szCs w:val="22"/>
+          <w:lang w:eastAsia="pt-BR"/>
+          <w14:ligatures w14:val="none"/>
+        </w:rPr>
+        <w:t> </w:t>
+      </w:r>
+    </w:p>
+    <w:p>
+      <w:pPr>
+        <w:pStyle w:val="NormalWeb"/>
+        <w:rPr>
+          <w:rFonts w:eastAsia="Times New Roman"/>
+          <w:kern w:val="0"/>
+          <w:sz w:val="22"/>
+          <w:szCs w:val="22"/>
+          <w:lang w:eastAsia="pt-BR"/>
+          <w14:ligatures w14:val="none"/>
+        </w:rPr>
+      </w:pPr>
+      <w:r>
+        <w:rPr>
+          <w:rFonts w:eastAsia="Times New Roman"/>
+          <w:kern w:val="0"/>
+          <w:sz w:val="22"/>
+          <w:szCs w:val="22"/>
+          <w:lang w:eastAsia="pt-BR"/>
+          <w14:ligatures w14:val="none"/>
+        </w:rPr>
+        <w:t>A recepcionista realiza o cadastro de clientes, apresentando os planos disponíveis. Os professores trabalham em turnos (manhã, tarde ou noite) e têm a capacidade de visualizar suas turmas, horários e estudantes matriculados. As turmas são organizadas de acordo com a modalidade, com docente responsável e número de estudantes.</w:t>
+      </w:r>
+    </w:p>
+    <w:p>
+      <w:pPr>
+        <w:pStyle w:val="NormalWeb"/>
+        <w:rPr>
+          <w:rFonts w:eastAsia="Times New Roman"/>
+          <w:kern w:val="0"/>
+          <w:sz w:val="22"/>
+          <w:szCs w:val="22"/>
+          <w:lang w:eastAsia="pt-BR"/>
+          <w14:ligatures w14:val="none"/>
+        </w:rPr>
+      </w:pPr>
+      <w:r>
+        <w:rPr>
+          <w:rFonts w:eastAsia="Times New Roman"/>
+          <w:kern w:val="0"/>
+          <w:sz w:val="22"/>
+          <w:szCs w:val="22"/>
+          <w:lang w:eastAsia="pt-BR"/>
+          <w14:ligatures w14:val="none"/>
+        </w:rPr>
+        <w:t>No site da academia, o estudante tem a possibilidade de conferir os planos, visualizar as modalidades e os horários, agendar encontros com os professores, acompanhar sua frequência e até mesmo solicitar uma visita presencial.</w:t>
+      </w:r>
+    </w:p>
+    <w:p>
+      <w:pPr>
+        <w:pStyle w:val="NormalWeb"/>
+        <w:rPr>
+          <w:rFonts w:eastAsia="Times New Roman"/>
+          <w:kern w:val="0"/>
+          <w:sz w:val="22"/>
+          <w:szCs w:val="22"/>
+          <w:lang w:eastAsia="pt-BR"/>
+          <w14:ligatures w14:val="none"/>
+        </w:rPr>
+      </w:pPr>
+      <w:r>
+        <w:rPr>
+          <w:rFonts w:eastAsia="Times New Roman"/>
+          <w:b/>
+          <w:bCs/>
+          <w:i/>
+          <w:iCs/>
+          <w:kern w:val="0"/>
+          <w:sz w:val="22"/>
+          <w:szCs w:val="22"/>
+          <w:lang w:eastAsia="pt-BR"/>
+          <w14:ligatures w14:val="none"/>
+        </w:rPr>
+        <w:t>Regra de negócios:</w:t>
+      </w:r>
+    </w:p>
+    <w:p>
+      <w:pPr>
+        <w:pStyle w:val="NormalWeb"/>
+        <w:rPr>
+          <w:rFonts w:eastAsia="Times New Roman"/>
+          <w:kern w:val="0"/>
+          <w:sz w:val="22"/>
+          <w:szCs w:val="22"/>
+          <w:lang w:eastAsia="pt-BR"/>
+          <w14:ligatures w14:val="none"/>
+        </w:rPr>
+      </w:pPr>
+      <w:r>
+        <w:rPr>
+          <w:rFonts w:eastAsia="Times New Roman"/>
+          <w:kern w:val="0"/>
+          <w:sz w:val="22"/>
+          <w:szCs w:val="22"/>
+          <w:lang w:eastAsia="pt-BR"/>
+          <w14:ligatures w14:val="none"/>
+        </w:rPr>
+        <w:lastRenderedPageBreak/>
+        <w:t> </w:t>
+      </w:r>
+    </w:p>
+    <w:p>
+      <w:pPr>
+        <w:pStyle w:val="NormalWeb"/>
+        <w:rPr>
+          <w:rFonts w:eastAsia="Times New Roman"/>
+          <w:kern w:val="0"/>
+          <w:sz w:val="22"/>
+          <w:szCs w:val="22"/>
+          <w:lang w:eastAsia="pt-BR"/>
+          <w14:ligatures w14:val="none"/>
+        </w:rPr>
+      </w:pPr>
+      <w:r>
+        <w:rPr>
+          <w:rFonts w:eastAsia="Times New Roman"/>
+          <w:kern w:val="0"/>
+          <w:sz w:val="22"/>
+          <w:szCs w:val="22"/>
+          <w:lang w:eastAsia="pt-BR"/>
+          <w14:ligatures w14:val="none"/>
+        </w:rPr>
+        <w:t> </w:t>
+      </w:r>
+    </w:p>
+    <w:p>
+      <w:pPr>
+        <w:pStyle w:val="NormalWeb"/>
+        <w:rPr>
+          <w:rFonts w:eastAsia="Times New Roman"/>
+          <w:kern w:val="0"/>
+          <w:sz w:val="22"/>
+          <w:szCs w:val="22"/>
+          <w:lang w:eastAsia="pt-BR"/>
+          <w14:ligatures w14:val="none"/>
+        </w:rPr>
+      </w:pPr>
+      <w:r>
+        <w:rPr>
+          <w:rFonts w:eastAsia="Times New Roman"/>
+          <w:b/>
+          <w:bCs/>
+          <w:kern w:val="0"/>
+          <w:sz w:val="22"/>
+          <w:szCs w:val="22"/>
+          <w:lang w:eastAsia="pt-BR"/>
+          <w14:ligatures w14:val="none"/>
+        </w:rPr>
+        <w:t>Aluno</w:t>
+      </w:r>
+    </w:p>
+    <w:p>
+      <w:pPr>
+        <w:pStyle w:val="NormalWeb"/>
+        <w:rPr>
+          <w:rFonts w:eastAsia="Times New Roman"/>
+          <w:kern w:val="0"/>
+          <w:sz w:val="22"/>
+          <w:szCs w:val="22"/>
+          <w:lang w:eastAsia="pt-BR"/>
+          <w14:ligatures w14:val="none"/>
+        </w:rPr>
+      </w:pPr>
+      <w:r>
+        <w:rPr>
+          <w:rFonts w:eastAsia="Times New Roman"/>
+          <w:kern w:val="0"/>
+          <w:sz w:val="22"/>
+          <w:szCs w:val="22"/>
+          <w:lang w:eastAsia="pt-BR"/>
+          <w14:ligatures w14:val="none"/>
+        </w:rPr>
+        <w:t>- Contendo os dados pessoais do cliente</w:t>
+      </w:r>
+    </w:p>
+    <w:p>
+      <w:pPr>
+        <w:pStyle w:val="NormalWeb"/>
+        <w:rPr>
+          <w:rFonts w:eastAsia="Times New Roman"/>
+          <w:kern w:val="0"/>
+          <w:sz w:val="22"/>
+          <w:szCs w:val="22"/>
+          <w:lang w:eastAsia="pt-BR"/>
+          <w14:ligatures w14:val="none"/>
+        </w:rPr>
+      </w:pPr>
+      <w:r>
+        <w:rPr>
+          <w:rFonts w:eastAsia="Times New Roman"/>
+          <w:kern w:val="0"/>
+          <w:sz w:val="22"/>
+          <w:szCs w:val="22"/>
+          <w:lang w:eastAsia="pt-BR"/>
+          <w14:ligatures w14:val="none"/>
+        </w:rPr>
+        <w:t> </w:t>
+      </w:r>
+    </w:p>
+    <w:p>
+      <w:pPr>
+        <w:pStyle w:val="NormalWeb"/>
+        <w:rPr>
+          <w:rFonts w:eastAsia="Times New Roman"/>
+          <w:kern w:val="0"/>
+          <w:sz w:val="22"/>
+          <w:szCs w:val="22"/>
+          <w:lang w:eastAsia="pt-BR"/>
+          <w14:ligatures w14:val="none"/>
+        </w:rPr>
+      </w:pPr>
+      <w:r>
+        <w:rPr>
+          <w:rFonts w:eastAsia="Times New Roman"/>
+          <w:kern w:val="0"/>
+          <w:sz w:val="22"/>
+          <w:szCs w:val="22"/>
+          <w:lang w:eastAsia="pt-BR"/>
+          <w14:ligatures w14:val="none"/>
+        </w:rPr>
+        <w:t> </w:t>
+      </w:r>
+    </w:p>
+    <w:p>
+      <w:pPr>
+        <w:pStyle w:val="NormalWeb"/>
+        <w:rPr>
+          <w:rFonts w:eastAsia="Times New Roman"/>
+          <w:kern w:val="0"/>
+          <w:sz w:val="22"/>
+          <w:szCs w:val="22"/>
+          <w:lang w:eastAsia="pt-BR"/>
+          <w14:ligatures w14:val="none"/>
+        </w:rPr>
+      </w:pPr>
+      <w:r>
+        <w:rPr>
+          <w:rFonts w:eastAsia="Times New Roman"/>
+          <w:b/>
+          <w:bCs/>
+          <w:kern w:val="0"/>
+          <w:sz w:val="22"/>
+          <w:szCs w:val="22"/>
+          <w:lang w:eastAsia="pt-BR"/>
+          <w14:ligatures w14:val="none"/>
+        </w:rPr>
+        <w:t>Recepcionista</w:t>
+      </w:r>
+    </w:p>
+    <w:p>
+      <w:pPr>
+        <w:pStyle w:val="NormalWeb"/>
+        <w:rPr>
+          <w:rFonts w:eastAsia="Times New Roman"/>
+          <w:kern w:val="0"/>
+          <w:sz w:val="22"/>
+          <w:szCs w:val="22"/>
+          <w:lang w:eastAsia="pt-BR"/>
+          <w14:ligatures w14:val="none"/>
+        </w:rPr>
+      </w:pPr>
+      <w:r>
+        <w:rPr>
+          <w:rFonts w:eastAsia="Times New Roman"/>
+          <w:kern w:val="0"/>
+          <w:sz w:val="22"/>
+          <w:szCs w:val="22"/>
+          <w:lang w:eastAsia="pt-BR"/>
+          <w14:ligatures w14:val="none"/>
+        </w:rPr>
+        <w:t>- A recepcionista é a única que pode cadastrar os aluno</w:t>
+      </w:r>
+    </w:p>
+    <w:p>
+      <w:pPr>
+        <w:pStyle w:val="NormalWeb"/>
+        <w:rPr>
+          <w:rFonts w:eastAsia="Times New Roman"/>
+          <w:kern w:val="0"/>
+          <w:sz w:val="22"/>
+          <w:szCs w:val="22"/>
+          <w:lang w:eastAsia="pt-BR"/>
+          <w14:ligatures w14:val="none"/>
+        </w:rPr>
+      </w:pPr>
+      <w:r>
+        <w:rPr>
+          <w:rFonts w:eastAsia="Times New Roman"/>
+          <w:kern w:val="0"/>
+          <w:sz w:val="22"/>
+          <w:szCs w:val="22"/>
+          <w:lang w:eastAsia="pt-BR"/>
+          <w14:ligatures w14:val="none"/>
+        </w:rPr>
+        <w:t>- Deverá conter alguns documentos dela</w:t>
+      </w:r>
+    </w:p>
+    <w:p>
+      <w:pPr>
+        <w:pStyle w:val="NormalWeb"/>
+        <w:rPr>
+          <w:rFonts w:eastAsia="Times New Roman"/>
+          <w:kern w:val="0"/>
+          <w:sz w:val="22"/>
+          <w:szCs w:val="22"/>
+          <w:lang w:eastAsia="pt-BR"/>
+          <w14:ligatures w14:val="none"/>
+        </w:rPr>
+      </w:pPr>
+      <w:r>
+        <w:rPr>
+          <w:rFonts w:eastAsia="Times New Roman"/>
+          <w:kern w:val="0"/>
+          <w:sz w:val="22"/>
+          <w:szCs w:val="22"/>
+          <w:lang w:eastAsia="pt-BR"/>
+          <w14:ligatures w14:val="none"/>
+        </w:rPr>
+        <w:t>- Cada recepcionista terá período</w:t>
+      </w:r>
+    </w:p>
+    <w:p>
+      <w:pPr>
+        <w:pStyle w:val="NormalWeb"/>
+        <w:rPr>
+          <w:rFonts w:eastAsia="Times New Roman"/>
+          <w:kern w:val="0"/>
+          <w:sz w:val="22"/>
+          <w:szCs w:val="22"/>
+          <w:lang w:eastAsia="pt-BR"/>
+          <w14:ligatures w14:val="none"/>
+        </w:rPr>
+      </w:pPr>
+      <w:r>
+        <w:rPr>
+          <w:rFonts w:eastAsia="Times New Roman"/>
+          <w:b/>
+          <w:bCs/>
+          <w:kern w:val="0"/>
+          <w:sz w:val="22"/>
+          <w:szCs w:val="22"/>
+          <w:lang w:eastAsia="pt-BR"/>
+          <w14:ligatures w14:val="none"/>
+        </w:rPr>
+        <w:t>Professores</w:t>
+      </w:r>
+    </w:p>
+    <w:p>
+      <w:pPr>
+        <w:pStyle w:val="NormalWeb"/>
+        <w:rPr>
+          <w:rFonts w:eastAsia="Times New Roman"/>
+          <w:kern w:val="0"/>
+          <w:sz w:val="22"/>
+          <w:szCs w:val="22"/>
+          <w:lang w:eastAsia="pt-BR"/>
+          <w14:ligatures w14:val="none"/>
+        </w:rPr>
+      </w:pPr>
+      <w:r>
+        <w:rPr>
+          <w:rFonts w:eastAsia="Times New Roman"/>
+          <w:kern w:val="0"/>
+          <w:sz w:val="22"/>
+          <w:szCs w:val="22"/>
+          <w:lang w:eastAsia="pt-BR"/>
+          <w14:ligatures w14:val="none"/>
+        </w:rPr>
+        <w:t>- Contendo os dados pessoais do professor para ter acesso em algumas áreas</w:t>
+      </w:r>
+    </w:p>
+    <w:p>
+      <w:pPr>
+        <w:pStyle w:val="NormalWeb"/>
+        <w:rPr>
+          <w:rFonts w:eastAsia="Times New Roman"/>
+          <w:kern w:val="0"/>
+          <w:sz w:val="22"/>
+          <w:szCs w:val="22"/>
+          <w:lang w:eastAsia="pt-BR"/>
+          <w14:ligatures w14:val="none"/>
+        </w:rPr>
+      </w:pPr>
+      <w:r>
+        <w:rPr>
+          <w:rFonts w:eastAsia="Times New Roman"/>
+          <w:kern w:val="0"/>
+          <w:sz w:val="22"/>
+          <w:szCs w:val="22"/>
+          <w:lang w:eastAsia="pt-BR"/>
+          <w14:ligatures w14:val="none"/>
+        </w:rPr>
+        <w:t>- Acesso as turmas que dará aula</w:t>
+      </w:r>
+    </w:p>
+    <w:p>
+      <w:pPr>
+        <w:pStyle w:val="NormalWeb"/>
+        <w:rPr>
+          <w:rFonts w:eastAsia="Times New Roman"/>
+          <w:kern w:val="0"/>
+          <w:sz w:val="22"/>
+          <w:szCs w:val="22"/>
+          <w:lang w:eastAsia="pt-BR"/>
+          <w14:ligatures w14:val="none"/>
+        </w:rPr>
+      </w:pPr>
+      <w:r>
+        <w:rPr>
+          <w:rFonts w:eastAsia="Times New Roman"/>
+          <w:kern w:val="0"/>
+          <w:sz w:val="22"/>
+          <w:szCs w:val="22"/>
+          <w:lang w:eastAsia="pt-BR"/>
+          <w14:ligatures w14:val="none"/>
+        </w:rPr>
+        <w:t> </w:t>
+      </w:r>
+    </w:p>
+    <w:p>
+      <w:pPr>
+        <w:pStyle w:val="NormalWeb"/>
+        <w:rPr>
+          <w:rFonts w:eastAsia="Times New Roman"/>
+          <w:kern w:val="0"/>
+          <w:sz w:val="22"/>
+          <w:szCs w:val="22"/>
+          <w:lang w:eastAsia="pt-BR"/>
+          <w14:ligatures w14:val="none"/>
+        </w:rPr>
+      </w:pPr>
+      <w:r>
+        <w:rPr>
+          <w:rFonts w:eastAsia="Times New Roman"/>
+          <w:b/>
+          <w:bCs/>
+          <w:kern w:val="0"/>
+          <w:sz w:val="22"/>
+          <w:szCs w:val="22"/>
+          <w:lang w:eastAsia="pt-BR"/>
+          <w14:ligatures w14:val="none"/>
+        </w:rPr>
+        <w:t>Planos</w:t>
+      </w:r>
+      <w:r>
+        <w:rPr>
+          <w:rFonts w:eastAsia="Times New Roman"/>
+          <w:kern w:val="0"/>
+          <w:sz w:val="22"/>
+          <w:szCs w:val="22"/>
+          <w:lang w:eastAsia="pt-BR"/>
+          <w14:ligatures w14:val="none"/>
+        </w:rPr>
+        <w:t>: Ouro, prata e bronze.</w:t>
+      </w:r>
+    </w:p>
+    <w:p>
+      <w:pPr>
+        <w:pStyle w:val="NormalWeb"/>
+        <w:rPr>
+          <w:rFonts w:eastAsia="Times New Roman"/>
+          <w:kern w:val="0"/>
+          <w:sz w:val="22"/>
+          <w:szCs w:val="22"/>
+          <w:lang w:eastAsia="pt-BR"/>
+          <w14:ligatures w14:val="none"/>
+        </w:rPr>
+      </w:pPr>
+      <w:r>
+        <w:rPr>
+          <w:rFonts w:eastAsia="Times New Roman"/>
+          <w:kern w:val="0"/>
+          <w:sz w:val="22"/>
+          <w:szCs w:val="22"/>
+          <w:lang w:eastAsia="pt-BR"/>
+          <w14:ligatures w14:val="none"/>
+        </w:rPr>
+        <w:t>Diferenciação de cada plano.</w:t>
+      </w:r>
+    </w:p>
+    <w:p>
+      <w:pPr>
+        <w:pStyle w:val="NormalWeb"/>
+        <w:rPr>
+          <w:rFonts w:eastAsia="Times New Roman"/>
+          <w:kern w:val="0"/>
+          <w:sz w:val="22"/>
+          <w:szCs w:val="22"/>
+          <w:lang w:eastAsia="pt-BR"/>
+          <w14:ligatures w14:val="none"/>
+        </w:rPr>
+      </w:pPr>
+      <w:r>
+        <w:rPr>
+          <w:rFonts w:eastAsia="Times New Roman"/>
+          <w:kern w:val="0"/>
+          <w:sz w:val="22"/>
+          <w:szCs w:val="22"/>
+          <w:lang w:eastAsia="pt-BR"/>
+          <w14:ligatures w14:val="none"/>
+        </w:rPr>
+        <w:t>Bronze(Plano apenas mensal):</w:t>
+      </w:r>
+    </w:p>
+    <w:p>
+      <w:pPr>
+        <w:pStyle w:val="NormalWeb"/>
+        <w:rPr>
+          <w:rFonts w:eastAsia="Times New Roman"/>
+          <w:kern w:val="0"/>
+          <w:sz w:val="22"/>
+          <w:szCs w:val="22"/>
+          <w:lang w:eastAsia="pt-BR"/>
+          <w14:ligatures w14:val="none"/>
+        </w:rPr>
+      </w:pPr>
+      <w:r>
+        <w:rPr>
+          <w:rFonts w:eastAsia="Times New Roman"/>
+          <w:kern w:val="0"/>
+          <w:sz w:val="22"/>
+          <w:szCs w:val="22"/>
+          <w:lang w:eastAsia="pt-BR"/>
+          <w14:ligatures w14:val="none"/>
+        </w:rPr>
+        <w:t xml:space="preserve">Musculação (uso livre dos aparelhos de peso e </w:t>
+      </w:r>
+      <w:proofErr w:type="spellStart"/>
+      <w:r>
+        <w:rPr>
+          <w:rFonts w:eastAsia="Times New Roman"/>
+          <w:kern w:val="0"/>
+          <w:sz w:val="22"/>
+          <w:szCs w:val="22"/>
+          <w:lang w:eastAsia="pt-BR"/>
+          <w14:ligatures w14:val="none"/>
+        </w:rPr>
+        <w:t>cardio</w:t>
+      </w:r>
+      <w:proofErr w:type="spellEnd"/>
+      <w:r>
+        <w:rPr>
+          <w:rFonts w:eastAsia="Times New Roman"/>
+          <w:kern w:val="0"/>
+          <w:sz w:val="22"/>
+          <w:szCs w:val="22"/>
+          <w:lang w:eastAsia="pt-BR"/>
+          <w14:ligatures w14:val="none"/>
+        </w:rPr>
+        <w:t>)</w:t>
+      </w:r>
+    </w:p>
+    <w:p>
+      <w:pPr>
+        <w:pStyle w:val="NormalWeb"/>
+        <w:rPr>
+          <w:rFonts w:eastAsia="Times New Roman"/>
+          <w:kern w:val="0"/>
+          <w:sz w:val="22"/>
+          <w:szCs w:val="22"/>
+          <w:lang w:eastAsia="pt-BR"/>
+          <w14:ligatures w14:val="none"/>
+        </w:rPr>
+      </w:pPr>
+      <w:r>
+        <w:rPr>
+          <w:rFonts w:eastAsia="Times New Roman"/>
+          <w:kern w:val="0"/>
+          <w:sz w:val="22"/>
+          <w:szCs w:val="22"/>
+          <w:lang w:eastAsia="pt-BR"/>
+          <w14:ligatures w14:val="none"/>
+        </w:rPr>
+        <w:t>Prata (Plano anual):</w:t>
+      </w:r>
+    </w:p>
+    <w:p>
+      <w:pPr>
+        <w:pStyle w:val="NormalWeb"/>
+        <w:rPr>
+          <w:rFonts w:eastAsia="Times New Roman"/>
+          <w:kern w:val="0"/>
+          <w:sz w:val="22"/>
+          <w:szCs w:val="22"/>
+          <w:lang w:eastAsia="pt-BR"/>
+          <w14:ligatures w14:val="none"/>
+        </w:rPr>
+      </w:pPr>
+      <w:r>
+        <w:rPr>
+          <w:rFonts w:eastAsia="Times New Roman"/>
+          <w:kern w:val="0"/>
+          <w:sz w:val="22"/>
+          <w:szCs w:val="22"/>
+          <w:lang w:eastAsia="pt-BR"/>
+          <w14:ligatures w14:val="none"/>
+        </w:rPr>
+        <w:t>Musculação</w:t>
+      </w:r>
+    </w:p>
+    <w:p>
+      <w:pPr>
+        <w:pStyle w:val="NormalWeb"/>
+        <w:rPr>
+          <w:rFonts w:eastAsia="Times New Roman"/>
+          <w:kern w:val="0"/>
+          <w:sz w:val="22"/>
+          <w:szCs w:val="22"/>
+          <w:lang w:eastAsia="pt-BR"/>
+          <w14:ligatures w14:val="none"/>
+        </w:rPr>
+      </w:pPr>
+      <w:proofErr w:type="spellStart"/>
+      <w:r>
+        <w:rPr>
+          <w:rFonts w:eastAsia="Times New Roman"/>
+          <w:kern w:val="0"/>
+          <w:sz w:val="22"/>
+          <w:szCs w:val="22"/>
+          <w:lang w:eastAsia="pt-BR"/>
+          <w14:ligatures w14:val="none"/>
+        </w:rPr>
+        <w:t>Spinning</w:t>
+      </w:r>
+      <w:proofErr w:type="spellEnd"/>
+    </w:p>
+    <w:p>
+      <w:pPr>
+        <w:pStyle w:val="NormalWeb"/>
+        <w:rPr>
+          <w:rFonts w:eastAsia="Times New Roman"/>
+          <w:kern w:val="0"/>
+          <w:sz w:val="22"/>
+          <w:szCs w:val="22"/>
+          <w:lang w:eastAsia="pt-BR"/>
+          <w14:ligatures w14:val="none"/>
+        </w:rPr>
+      </w:pPr>
+      <w:r>
+        <w:rPr>
+          <w:rFonts w:eastAsia="Times New Roman"/>
+          <w:kern w:val="0"/>
+          <w:sz w:val="22"/>
+          <w:szCs w:val="22"/>
+          <w:lang w:eastAsia="pt-BR"/>
+          <w14:ligatures w14:val="none"/>
+        </w:rPr>
+        <w:t>Pilates solo</w:t>
+      </w:r>
+    </w:p>
+    <w:p>
+      <w:pPr>
+        <w:pStyle w:val="NormalWeb"/>
+        <w:rPr>
+          <w:rFonts w:eastAsia="Times New Roman"/>
+          <w:kern w:val="0"/>
+          <w:sz w:val="22"/>
+          <w:szCs w:val="22"/>
+          <w:lang w:eastAsia="pt-BR"/>
+          <w14:ligatures w14:val="none"/>
+        </w:rPr>
+      </w:pPr>
+      <w:r>
+        <w:rPr>
+          <w:rFonts w:eastAsia="Times New Roman"/>
+          <w:kern w:val="0"/>
+          <w:sz w:val="22"/>
+          <w:szCs w:val="22"/>
+          <w:lang w:eastAsia="pt-BR"/>
+          <w14:ligatures w14:val="none"/>
+        </w:rPr>
+        <w:t>Jump</w:t>
+      </w:r>
+    </w:p>
+    <w:p>
+      <w:pPr>
+        <w:pStyle w:val="NormalWeb"/>
+        <w:rPr>
+          <w:rFonts w:eastAsia="Times New Roman"/>
+          <w:kern w:val="0"/>
+          <w:sz w:val="22"/>
+          <w:szCs w:val="22"/>
+          <w:lang w:eastAsia="pt-BR"/>
+          <w14:ligatures w14:val="none"/>
+        </w:rPr>
+      </w:pPr>
+      <w:r>
+        <w:rPr>
+          <w:rFonts w:eastAsia="Times New Roman"/>
+          <w:kern w:val="0"/>
+          <w:sz w:val="22"/>
+          <w:szCs w:val="22"/>
+          <w:lang w:eastAsia="pt-BR"/>
+          <w14:ligatures w14:val="none"/>
+        </w:rPr>
+        <w:t>Hidroginástica</w:t>
+      </w:r>
+    </w:p>
+    <w:p>
+      <w:pPr>
+        <w:pStyle w:val="NormalWeb"/>
+        <w:rPr>
+          <w:rFonts w:eastAsia="Times New Roman"/>
+          <w:kern w:val="0"/>
+          <w:sz w:val="22"/>
+          <w:szCs w:val="22"/>
+          <w:lang w:eastAsia="pt-BR"/>
+          <w14:ligatures w14:val="none"/>
+        </w:rPr>
+      </w:pPr>
+      <w:r>
+        <w:rPr>
+          <w:rFonts w:eastAsia="Times New Roman"/>
+          <w:kern w:val="0"/>
+          <w:sz w:val="22"/>
+          <w:szCs w:val="22"/>
+          <w:lang w:eastAsia="pt-BR"/>
+          <w14:ligatures w14:val="none"/>
+        </w:rPr>
+        <w:t> </w:t>
+      </w:r>
+    </w:p>
+    <w:p>
+      <w:pPr>
+        <w:pStyle w:val="NormalWeb"/>
+        <w:rPr>
+          <w:rFonts w:eastAsia="Times New Roman"/>
+          <w:kern w:val="0"/>
+          <w:sz w:val="22"/>
+          <w:szCs w:val="22"/>
+          <w:lang w:eastAsia="pt-BR"/>
+          <w14:ligatures w14:val="none"/>
+        </w:rPr>
+      </w:pPr>
+      <w:r>
+        <w:rPr>
+          <w:rFonts w:eastAsia="Times New Roman"/>
+          <w:kern w:val="0"/>
+          <w:sz w:val="22"/>
+          <w:szCs w:val="22"/>
+          <w:lang w:eastAsia="pt-BR"/>
+          <w14:ligatures w14:val="none"/>
+        </w:rPr>
+        <w:t>Ouro(Plano anual):</w:t>
+      </w:r>
+    </w:p>
+    <w:p>
+      <w:pPr>
+        <w:pStyle w:val="NormalWeb"/>
+        <w:rPr>
+          <w:rFonts w:eastAsia="Times New Roman"/>
+          <w:kern w:val="0"/>
+          <w:sz w:val="22"/>
+          <w:szCs w:val="22"/>
+          <w:lang w:eastAsia="pt-BR"/>
+          <w14:ligatures w14:val="none"/>
+        </w:rPr>
+      </w:pPr>
+      <w:r>
+        <w:rPr>
+          <w:rFonts w:eastAsia="Times New Roman"/>
+          <w:kern w:val="0"/>
+          <w:sz w:val="22"/>
+          <w:szCs w:val="22"/>
+          <w:lang w:eastAsia="pt-BR"/>
+          <w14:ligatures w14:val="none"/>
+        </w:rPr>
+        <w:t>Musculação</w:t>
+      </w:r>
+    </w:p>
+    <w:p>
+      <w:pPr>
+        <w:pStyle w:val="NormalWeb"/>
+        <w:rPr>
+          <w:rFonts w:eastAsia="Times New Roman"/>
+          <w:kern w:val="0"/>
+          <w:sz w:val="22"/>
+          <w:szCs w:val="22"/>
+          <w:lang w:eastAsia="pt-BR"/>
+          <w14:ligatures w14:val="none"/>
+        </w:rPr>
+      </w:pPr>
+      <w:proofErr w:type="spellStart"/>
+      <w:r>
+        <w:rPr>
+          <w:rFonts w:eastAsia="Times New Roman"/>
+          <w:kern w:val="0"/>
+          <w:sz w:val="22"/>
+          <w:szCs w:val="22"/>
+          <w:lang w:eastAsia="pt-BR"/>
+          <w14:ligatures w14:val="none"/>
+        </w:rPr>
+        <w:t>Spinning</w:t>
+      </w:r>
+      <w:proofErr w:type="spellEnd"/>
+    </w:p>
+    <w:p>
+      <w:pPr>
+        <w:pStyle w:val="NormalWeb"/>
+        <w:rPr>
+          <w:rFonts w:eastAsia="Times New Roman"/>
+          <w:kern w:val="0"/>
+          <w:sz w:val="22"/>
+          <w:szCs w:val="22"/>
+          <w:lang w:eastAsia="pt-BR"/>
+          <w14:ligatures w14:val="none"/>
+        </w:rPr>
+      </w:pPr>
+      <w:r>
+        <w:rPr>
+          <w:rFonts w:eastAsia="Times New Roman"/>
+          <w:kern w:val="0"/>
+          <w:sz w:val="22"/>
+          <w:szCs w:val="22"/>
+          <w:lang w:eastAsia="pt-BR"/>
+          <w14:ligatures w14:val="none"/>
+        </w:rPr>
+        <w:t>Pilates completo (com equipamentos)</w:t>
+      </w:r>
+    </w:p>
+    <w:p>
+      <w:pPr>
+        <w:pStyle w:val="NormalWeb"/>
+        <w:rPr>
+          <w:rFonts w:eastAsia="Times New Roman"/>
+          <w:kern w:val="0"/>
+          <w:sz w:val="22"/>
+          <w:szCs w:val="22"/>
+          <w:lang w:eastAsia="pt-BR"/>
+          <w14:ligatures w14:val="none"/>
+        </w:rPr>
+      </w:pPr>
+      <w:r>
+        <w:rPr>
+          <w:rFonts w:eastAsia="Times New Roman"/>
+          <w:kern w:val="0"/>
+          <w:sz w:val="22"/>
+          <w:szCs w:val="22"/>
+          <w:lang w:eastAsia="pt-BR"/>
+          <w14:ligatures w14:val="none"/>
+        </w:rPr>
+        <w:t>Jump</w:t>
+      </w:r>
+    </w:p>
+    <w:p>
+      <w:pPr>
+        <w:pStyle w:val="NormalWeb"/>
+        <w:rPr>
+          <w:rFonts w:eastAsia="Times New Roman"/>
+          <w:kern w:val="0"/>
+          <w:sz w:val="22"/>
+          <w:szCs w:val="22"/>
+          <w:lang w:eastAsia="pt-BR"/>
+          <w14:ligatures w14:val="none"/>
+        </w:rPr>
+      </w:pPr>
+      <w:r>
+        <w:rPr>
+          <w:rFonts w:eastAsia="Times New Roman"/>
+          <w:kern w:val="0"/>
+          <w:sz w:val="22"/>
+          <w:szCs w:val="22"/>
+          <w:lang w:eastAsia="pt-BR"/>
+          <w14:ligatures w14:val="none"/>
+        </w:rPr>
+        <w:t>Hidroginástica</w:t>
+      </w:r>
+    </w:p>
+    <w:p>
+      <w:pPr>
+        <w:pStyle w:val="NormalWeb"/>
+        <w:rPr>
+          <w:rFonts w:eastAsia="Times New Roman"/>
+          <w:kern w:val="0"/>
+          <w:sz w:val="22"/>
+          <w:szCs w:val="22"/>
+          <w:lang w:eastAsia="pt-BR"/>
+          <w14:ligatures w14:val="none"/>
+        </w:rPr>
+      </w:pPr>
+      <w:r>
+        <w:rPr>
+          <w:rFonts w:eastAsia="Times New Roman"/>
+          <w:kern w:val="0"/>
+          <w:sz w:val="22"/>
+          <w:szCs w:val="22"/>
+          <w:lang w:eastAsia="pt-BR"/>
+          <w14:ligatures w14:val="none"/>
+        </w:rPr>
+        <w:lastRenderedPageBreak/>
+        <w:t>Cross Training</w:t>
+      </w:r>
+    </w:p>
+    <w:p>
+      <w:pPr>
+        <w:pStyle w:val="NormalWeb"/>
+        <w:rPr>
+          <w:rFonts w:eastAsia="Times New Roman"/>
+          <w:kern w:val="0"/>
+          <w:sz w:val="22"/>
+          <w:szCs w:val="22"/>
+          <w:lang w:eastAsia="pt-BR"/>
+          <w14:ligatures w14:val="none"/>
+        </w:rPr>
+      </w:pPr>
+      <w:r>
+        <w:rPr>
+          <w:rFonts w:eastAsia="Times New Roman"/>
+          <w:kern w:val="0"/>
+          <w:sz w:val="22"/>
+          <w:szCs w:val="22"/>
+          <w:lang w:eastAsia="pt-BR"/>
+          <w14:ligatures w14:val="none"/>
+        </w:rPr>
+        <w:t>Dança/Zumba</w:t>
+      </w:r>
+    </w:p>
+    <w:p>
+      <w:pPr>
+        <w:pStyle w:val="NormalWeb"/>
+        <w:rPr>
+          <w:rFonts w:eastAsia="Times New Roman"/>
+          <w:kern w:val="0"/>
+          <w:sz w:val="22"/>
+          <w:szCs w:val="22"/>
+          <w:lang w:eastAsia="pt-BR"/>
+          <w14:ligatures w14:val="none"/>
+        </w:rPr>
+      </w:pPr>
+      <w:r>
+        <w:rPr>
+          <w:rFonts w:eastAsia="Times New Roman"/>
+          <w:kern w:val="0"/>
+          <w:sz w:val="22"/>
+          <w:szCs w:val="22"/>
+          <w:lang w:eastAsia="pt-BR"/>
+          <w14:ligatures w14:val="none"/>
+        </w:rPr>
+        <w:t>Artes Marciais (</w:t>
+      </w:r>
+      <w:proofErr w:type="spellStart"/>
+      <w:r>
+        <w:rPr>
+          <w:rFonts w:eastAsia="Times New Roman"/>
+          <w:kern w:val="0"/>
+          <w:sz w:val="22"/>
+          <w:szCs w:val="22"/>
+          <w:lang w:eastAsia="pt-BR"/>
+          <w14:ligatures w14:val="none"/>
+        </w:rPr>
+        <w:t>Muay</w:t>
+      </w:r>
+      <w:proofErr w:type="spellEnd"/>
+      <w:r>
+        <w:rPr>
+          <w:rFonts w:eastAsia="Times New Roman"/>
+          <w:kern w:val="0"/>
+          <w:sz w:val="22"/>
+          <w:szCs w:val="22"/>
+          <w:lang w:eastAsia="pt-BR"/>
+          <w14:ligatures w14:val="none"/>
+        </w:rPr>
+        <w:t xml:space="preserve"> Thai, Jiu-Jitsu...)</w:t>
+      </w:r>
+    </w:p>
+    <w:p>
+      <w:pPr>
+        <w:pStyle w:val="NormalWeb"/>
+        <w:rPr>
+          <w:rFonts w:eastAsia="Times New Roman"/>
+          <w:kern w:val="0"/>
+          <w:sz w:val="22"/>
+          <w:szCs w:val="22"/>
+          <w:lang w:eastAsia="pt-BR"/>
+          <w14:ligatures w14:val="none"/>
+        </w:rPr>
+      </w:pPr>
+      <w:r>
+        <w:rPr>
+          <w:rFonts w:eastAsia="Times New Roman"/>
+          <w:kern w:val="0"/>
+          <w:sz w:val="22"/>
+          <w:szCs w:val="22"/>
+          <w:lang w:eastAsia="pt-BR"/>
+          <w14:ligatures w14:val="none"/>
+        </w:rPr>
+        <w:t>Natação</w:t>
+      </w:r>
+    </w:p>
+    <w:p>
+      <w:pPr>
+        <w:pStyle w:val="NormalWeb"/>
+        <w:rPr>
+          <w:rFonts w:eastAsia="Times New Roman"/>
+          <w:kern w:val="0"/>
+          <w:sz w:val="22"/>
+          <w:szCs w:val="22"/>
+          <w:lang w:eastAsia="pt-BR"/>
+          <w14:ligatures w14:val="none"/>
+        </w:rPr>
+      </w:pPr>
+      <w:r>
+        <w:rPr>
+          <w:rFonts w:eastAsia="Times New Roman"/>
+          <w:kern w:val="0"/>
+          <w:sz w:val="22"/>
+          <w:szCs w:val="22"/>
+          <w:lang w:eastAsia="pt-BR"/>
+          <w14:ligatures w14:val="none"/>
+        </w:rPr>
+        <w:t>Professor particular</w:t>
+      </w:r>
+    </w:p>
+    <w:p>
+      <w:pPr>
+        <w:pStyle w:val="NormalWeb"/>
+        <w:rPr>
+          <w:rFonts w:eastAsia="Times New Roman"/>
+          <w:kern w:val="0"/>
+          <w:sz w:val="22"/>
+          <w:szCs w:val="22"/>
+          <w:lang w:eastAsia="pt-BR"/>
+          <w14:ligatures w14:val="none"/>
+        </w:rPr>
+      </w:pPr>
+      <w:r>
+        <w:rPr>
+          <w:rFonts w:eastAsia="Times New Roman"/>
+          <w:b/>
+          <w:bCs/>
+          <w:kern w:val="0"/>
+          <w:sz w:val="22"/>
+          <w:szCs w:val="22"/>
+          <w:lang w:eastAsia="pt-BR"/>
+          <w14:ligatures w14:val="none"/>
+        </w:rPr>
+        <w:t>Modalidade</w:t>
+      </w:r>
+    </w:p>
+    <w:p>
+      <w:pPr>
+        <w:pStyle w:val="NormalWeb"/>
+        <w:rPr>
+          <w:rFonts w:eastAsia="Times New Roman"/>
+          <w:kern w:val="0"/>
+          <w:sz w:val="22"/>
+          <w:szCs w:val="22"/>
+          <w:lang w:eastAsia="pt-BR"/>
+          <w14:ligatures w14:val="none"/>
+        </w:rPr>
+      </w:pPr>
+      <w:r>
+        <w:rPr>
+          <w:rFonts w:eastAsia="Times New Roman"/>
+          <w:kern w:val="0"/>
+          <w:sz w:val="22"/>
+          <w:szCs w:val="22"/>
+          <w:lang w:eastAsia="pt-BR"/>
+          <w14:ligatures w14:val="none"/>
+        </w:rPr>
+        <w:t xml:space="preserve">- Cadastro de cada modalidade: </w:t>
+      </w:r>
+      <w:proofErr w:type="spellStart"/>
+      <w:r>
+        <w:rPr>
+          <w:rFonts w:eastAsia="Times New Roman"/>
+          <w:kern w:val="0"/>
+          <w:sz w:val="22"/>
+          <w:szCs w:val="22"/>
+          <w:lang w:eastAsia="pt-BR"/>
+          <w14:ligatures w14:val="none"/>
+        </w:rPr>
+        <w:t>speanning</w:t>
+      </w:r>
+      <w:proofErr w:type="spellEnd"/>
+      <w:r>
+        <w:rPr>
+          <w:rFonts w:eastAsia="Times New Roman"/>
+          <w:kern w:val="0"/>
+          <w:sz w:val="22"/>
+          <w:szCs w:val="22"/>
+          <w:lang w:eastAsia="pt-BR"/>
+          <w14:ligatures w14:val="none"/>
+        </w:rPr>
+        <w:t>, musculação, natação, hidroginástica...</w:t>
+      </w:r>
+    </w:p>
+    <w:p>
+      <w:pPr>
+        <w:pStyle w:val="NormalWeb"/>
+        <w:rPr>
+          <w:rFonts w:eastAsia="Times New Roman"/>
+          <w:kern w:val="0"/>
+          <w:sz w:val="22"/>
+          <w:szCs w:val="22"/>
+          <w:lang w:eastAsia="pt-BR"/>
+          <w14:ligatures w14:val="none"/>
+        </w:rPr>
+      </w:pPr>
+      <w:r>
+        <w:rPr>
+          <w:rFonts w:eastAsia="Times New Roman"/>
+          <w:kern w:val="0"/>
+          <w:sz w:val="22"/>
+          <w:szCs w:val="22"/>
+          <w:lang w:eastAsia="pt-BR"/>
+          <w14:ligatures w14:val="none"/>
+        </w:rPr>
+        <w:t>- Valor de cada modalidade</w:t>
+      </w:r>
+    </w:p>
+    <w:p>
+      <w:pPr>
+        <w:pStyle w:val="NormalWeb"/>
+        <w:rPr>
+          <w:rFonts w:eastAsia="Times New Roman"/>
+          <w:kern w:val="0"/>
+          <w:sz w:val="22"/>
+          <w:szCs w:val="22"/>
+          <w:lang w:eastAsia="pt-BR"/>
+          <w14:ligatures w14:val="none"/>
+        </w:rPr>
+      </w:pPr>
+      <w:r>
+        <w:rPr>
+          <w:rFonts w:eastAsia="Times New Roman"/>
+          <w:kern w:val="0"/>
+          <w:sz w:val="22"/>
+          <w:szCs w:val="22"/>
+          <w:lang w:eastAsia="pt-BR"/>
+          <w14:ligatures w14:val="none"/>
+        </w:rPr>
+        <w:t>- Descrição de cada modalidade</w:t>
+      </w:r>
+    </w:p>
+    <w:p>
+      <w:pPr>
+        <w:pStyle w:val="NormalWeb"/>
+        <w:rPr>
+          <w:rFonts w:eastAsia="Times New Roman"/>
+          <w:kern w:val="0"/>
+          <w:sz w:val="22"/>
+          <w:szCs w:val="22"/>
+          <w:lang w:eastAsia="pt-BR"/>
+          <w14:ligatures w14:val="none"/>
+        </w:rPr>
+      </w:pPr>
+      <w:r>
+        <w:rPr>
+          <w:rFonts w:eastAsia="Times New Roman"/>
+          <w:kern w:val="0"/>
+          <w:sz w:val="22"/>
+          <w:szCs w:val="22"/>
+          <w:lang w:eastAsia="pt-BR"/>
+          <w14:ligatures w14:val="none"/>
+        </w:rPr>
+        <w:t> </w:t>
+      </w:r>
+    </w:p>
+    <w:p>
+      <w:pPr>
+        <w:pStyle w:val="NormalWeb"/>
+        <w:rPr>
+          <w:rFonts w:eastAsia="Times New Roman"/>
+          <w:kern w:val="0"/>
+          <w:sz w:val="22"/>
+          <w:szCs w:val="22"/>
+          <w:lang w:eastAsia="pt-BR"/>
+          <w14:ligatures w14:val="none"/>
+        </w:rPr>
+      </w:pPr>
+      <w:r>
+        <w:rPr>
+          <w:rFonts w:eastAsia="Times New Roman"/>
+          <w:b/>
+          <w:bCs/>
+          <w:kern w:val="0"/>
+          <w:sz w:val="22"/>
+          <w:szCs w:val="22"/>
+          <w:lang w:eastAsia="pt-BR"/>
+          <w14:ligatures w14:val="none"/>
+        </w:rPr>
+        <w:t>Curso Livre</w:t>
+      </w:r>
+    </w:p>
+    <w:p>
+      <w:pPr>
+        <w:pStyle w:val="NormalWeb"/>
+        <w:rPr>
+          <w:rFonts w:eastAsia="Times New Roman"/>
+          <w:kern w:val="0"/>
+          <w:sz w:val="22"/>
+          <w:szCs w:val="22"/>
+          <w:lang w:eastAsia="pt-BR"/>
+          <w14:ligatures w14:val="none"/>
+        </w:rPr>
+      </w:pPr>
+      <w:r>
+        <w:rPr>
+          <w:rFonts w:eastAsia="Times New Roman"/>
+          <w:kern w:val="0"/>
+          <w:sz w:val="22"/>
+          <w:szCs w:val="22"/>
+          <w:lang w:eastAsia="pt-BR"/>
+          <w14:ligatures w14:val="none"/>
+        </w:rPr>
+        <w:t>- Geralmente o curso livre tem valor próprio (mensalidade ou taxa única), separado do plano da academia.</w:t>
+      </w:r>
+    </w:p>
+    <w:p>
+      <w:pPr>
+        <w:pStyle w:val="NormalWeb"/>
+        <w:rPr>
+          <w:rFonts w:eastAsia="Times New Roman"/>
+          <w:kern w:val="0"/>
+          <w:sz w:val="22"/>
+          <w:szCs w:val="22"/>
+          <w:lang w:eastAsia="pt-BR"/>
+          <w14:ligatures w14:val="none"/>
+        </w:rPr>
+      </w:pPr>
+      <w:r>
+        <w:rPr>
+          <w:rFonts w:eastAsia="Times New Roman"/>
+          <w:kern w:val="0"/>
+          <w:sz w:val="22"/>
+          <w:szCs w:val="22"/>
+          <w:lang w:eastAsia="pt-BR"/>
+          <w14:ligatures w14:val="none"/>
+        </w:rPr>
+        <w:t>- Para participar, o aluno deve realizar uma matrícula no curso livre, vinculando:</w:t>
       </w:r>
     </w:p>
     <w:p>
@@ -295,36 +1677,27 @@
         <w:pStyle w:val="NormalWeb"/>
         <w:numPr>
           <w:ilvl w:val="0"/>
-          <w:numId w:val="1"/>
+          <w:numId w:val="8"/>
         </w:numPr>
         <w:rPr>
           <w:rFonts w:eastAsia="Times New Roman"/>
-          <w:sz w:val="22"/>
-          <w:szCs w:val="22"/>
-          <w:lang w:eastAsia="pt-BR"/>
-        </w:rPr>
-      </w:pPr>
-      <w:r>
-        <w:rPr>
-          <w:rFonts w:eastAsia="Times New Roman"/>
-          <w:kern w:val="0"/>
-          <w:sz w:val="22"/>
-          <w:szCs w:val="22"/>
-          <w:lang w:eastAsia="pt-BR"/>
-          <w14:ligatures w14:val="none"/>
-        </w:rPr>
-        <w:t>U</w:t>
-      </w:r>
-      <w:r>
-        <w:rPr>
-          <w:rFonts w:eastAsia="Times New Roman"/>
-          <w:kern w:val="0"/>
-          <w:sz w:val="22"/>
-          <w:szCs w:val="22"/>
-          <w:lang w:eastAsia="pt-BR"/>
-          <w14:ligatures w14:val="none"/>
-        </w:rPr>
-        <w:t>ma recepcionista que irá cadastrar os usuários e apresentar os planos.</w:t>
+          <w:kern w:val="0"/>
+          <w:sz w:val="22"/>
+          <w:szCs w:val="22"/>
+          <w:lang w:eastAsia="pt-BR"/>
+          <w14:ligatures w14:val="none"/>
+        </w:rPr>
+      </w:pPr>
+      <w:r>
+        <w:rPr>
+          <w:rFonts w:eastAsia="Times New Roman"/>
+          <w:kern w:val="0"/>
+          <w:sz w:val="22"/>
+          <w:szCs w:val="22"/>
+          <w:lang w:eastAsia="pt-BR"/>
+          <w14:ligatures w14:val="none"/>
+        </w:rPr>
+        <w:t>aluno,</w:t>
       </w:r>
     </w:p>
     <w:p>
@@ -332,385 +1705,1134 @@
         <w:pStyle w:val="NormalWeb"/>
         <w:numPr>
           <w:ilvl w:val="0"/>
-          <w:numId w:val="1"/>
+          <w:numId w:val="8"/>
         </w:numPr>
         <w:rPr>
-          <w:rFonts w:ascii="Consolas" w:eastAsia="Times New Roman" w:hAnsi="Consolas" w:cs="Arial"/>
-          <w:sz w:val="22"/>
-          <w:szCs w:val="22"/>
-          <w:lang w:eastAsia="pt-BR"/>
-        </w:rPr>
-      </w:pPr>
-      <w:r>
-        <w:rPr>
-          <w:rFonts w:eastAsia="Times New Roman"/>
-          <w:sz w:val="22"/>
-          <w:szCs w:val="22"/>
-          <w:lang w:eastAsia="pt-BR"/>
-        </w:rPr>
-        <w:t>clientes queiram fazer o cancelamento antes, eles terão que avisar com 1 mês de antecedência antes da vigência do plano, caso ele insista, terá que pagar uma multa de 30%.</w:t>
-      </w:r>
-    </w:p>
-    <w:p>
-      <w:pPr>
-        <w:pStyle w:val="NormalWeb"/>
-        <w:rPr>
-          <w:rFonts w:eastAsia="Times New Roman"/>
-          <w:sz w:val="22"/>
-          <w:szCs w:val="22"/>
-          <w:lang w:eastAsia="pt-BR"/>
-        </w:rPr>
-      </w:pPr>
-      <w:r>
-        <w:rPr>
-          <w:rFonts w:eastAsia="Times New Roman"/>
-          <w:kern w:val="0"/>
-          <w:sz w:val="22"/>
-          <w:szCs w:val="22"/>
-          <w:lang w:eastAsia="pt-BR"/>
-          <w14:ligatures w14:val="none"/>
-        </w:rPr>
-        <w:t xml:space="preserve"> </w:t>
-      </w:r>
-      <w:r>
-        <w:rPr>
-          <w:rFonts w:eastAsia="Times New Roman"/>
-          <w:kern w:val="0"/>
-          <w:sz w:val="22"/>
-          <w:szCs w:val="22"/>
-          <w:lang w:eastAsia="pt-BR"/>
-          <w14:ligatures w14:val="none"/>
-        </w:rPr>
-        <w:t xml:space="preserve">Como será feito o cadastro dos Professores? </w:t>
-      </w:r>
-    </w:p>
-    <w:p>
-      <w:pPr>
-        <w:pStyle w:val="NormalWeb"/>
-        <w:rPr>
-          <w:rFonts w:eastAsia="Times New Roman"/>
-          <w:sz w:val="22"/>
-          <w:szCs w:val="22"/>
-          <w:lang w:eastAsia="pt-BR"/>
-        </w:rPr>
-      </w:pPr>
-      <w:r>
-        <w:rPr>
-          <w:rFonts w:eastAsia="Times New Roman"/>
-          <w:sz w:val="22"/>
-          <w:szCs w:val="22"/>
-          <w:lang w:eastAsia="pt-BR"/>
-        </w:rPr>
-        <w:t>Os professores só poderão trabalhar por períodos (sendo eles: manhã, tarde e noite).</w:t>
-      </w:r>
-    </w:p>
-    <w:p>
-      <w:pPr>
-        <w:pStyle w:val="NormalWeb"/>
-        <w:ind w:firstLine="708"/>
-        <w:rPr>
-          <w:rFonts w:eastAsia="Times New Roman"/>
-          <w:sz w:val="22"/>
-          <w:szCs w:val="22"/>
-          <w:lang w:eastAsia="pt-BR"/>
-        </w:rPr>
-      </w:pPr>
-      <w:r>
-        <w:rPr>
-          <w:rFonts w:eastAsia="Times New Roman"/>
-          <w:sz w:val="22"/>
-          <w:szCs w:val="22"/>
-          <w:lang w:eastAsia="pt-BR"/>
-        </w:rPr>
-        <w:t>Os professores conseguem visualizar as turmas, quem serão os alunos participantes e os horários caso haja agendamento</w:t>
-      </w:r>
-    </w:p>
-    <w:p>
-      <w:pPr>
-        <w:pStyle w:val="NormalWeb"/>
-        <w:rPr>
-          <w:rFonts w:eastAsia="Times New Roman"/>
-          <w:sz w:val="22"/>
-          <w:szCs w:val="22"/>
-          <w:lang w:eastAsia="pt-BR"/>
-        </w:rPr>
-      </w:pPr>
-      <w:r>
-        <w:rPr>
-          <w:rFonts w:eastAsia="Times New Roman"/>
-          <w:sz w:val="22"/>
-          <w:szCs w:val="22"/>
-          <w:lang w:eastAsia="pt-BR"/>
-        </w:rPr>
-        <w:t>Como será feito o cadastro das Turmas?</w:t>
-      </w:r>
-    </w:p>
-    <w:p>
-      <w:pPr>
-        <w:pStyle w:val="NormalWeb"/>
-        <w:rPr>
-          <w:rFonts w:eastAsia="Times New Roman"/>
-          <w:sz w:val="22"/>
-          <w:szCs w:val="22"/>
-          <w:lang w:eastAsia="pt-BR"/>
-        </w:rPr>
-      </w:pPr>
-      <w:r>
-        <w:rPr>
-          <w:rFonts w:eastAsia="Times New Roman"/>
-          <w:sz w:val="22"/>
-          <w:szCs w:val="22"/>
-          <w:lang w:eastAsia="pt-BR"/>
-        </w:rPr>
-        <w:t>Como será feito o cadastro de Modalidades?</w:t>
-      </w:r>
-    </w:p>
-    <w:p>
-      <w:pPr>
-        <w:pStyle w:val="NormalWeb"/>
-        <w:rPr>
-          <w:rFonts w:eastAsia="Times New Roman"/>
-          <w:sz w:val="22"/>
-          <w:szCs w:val="22"/>
-          <w:lang w:eastAsia="pt-BR"/>
-        </w:rPr>
-      </w:pPr>
-      <w:r>
-        <w:rPr>
-          <w:rFonts w:eastAsia="Times New Roman"/>
-          <w:sz w:val="22"/>
-          <w:szCs w:val="22"/>
-          <w:lang w:eastAsia="pt-BR"/>
-        </w:rPr>
-        <w:t xml:space="preserve">Vai ter um site? </w:t>
-      </w:r>
-    </w:p>
-    <w:p>
-      <w:pPr>
-        <w:pStyle w:val="NormalWeb"/>
-        <w:rPr>
-          <w:u w:val="single"/>
-        </w:rPr>
-      </w:pPr>
-      <w:r>
-        <w:rPr>
-          <w:rFonts w:eastAsia="Times New Roman"/>
-          <w:kern w:val="0"/>
-          <w:sz w:val="22"/>
-          <w:szCs w:val="22"/>
-          <w:lang w:eastAsia="pt-BR"/>
-          <w14:ligatures w14:val="none"/>
-        </w:rPr>
-        <w:t xml:space="preserve">Dentro do site o aluno consegue visualizar as aulas disponíveis, agendar horário com os professores e a frequências. </w:t>
-      </w:r>
-    </w:p>
-    <w:p>
-      <w:pPr>
-        <w:pStyle w:val="NormalWeb"/>
-      </w:pPr>
-    </w:p>
-    <w:p>
-      <w:pPr>
-        <w:pStyle w:val="NormalWeb"/>
-      </w:pPr>
-    </w:p>
-    <w:p>
-      <w:pPr>
-        <w:pStyle w:val="NormalWeb"/>
-      </w:pPr>
-    </w:p>
-    <w:p>
-      <w:pPr>
-        <w:pStyle w:val="NormalWeb"/>
-      </w:pPr>
-    </w:p>
-    <w:p>
-      <w:pPr>
-        <w:pStyle w:val="NormalWeb"/>
-      </w:pPr>
-    </w:p>
-    <w:p>
-      <w:pPr>
-        <w:pStyle w:val="NormalWeb"/>
-        <w:rPr>
-          <w:u w:val="single"/>
-        </w:rPr>
-      </w:pPr>
-      <w:r>
-        <w:br/>
-        <w:t>No site estão criando? Agendar visita ou visualizar os planos;</w:t>
-      </w:r>
-    </w:p>
-    <w:p>
-      <w:pPr>
+          <w:rFonts w:eastAsia="Times New Roman"/>
+          <w:kern w:val="0"/>
+          <w:sz w:val="22"/>
+          <w:szCs w:val="22"/>
+          <w:lang w:eastAsia="pt-BR"/>
+          <w14:ligatures w14:val="none"/>
+        </w:rPr>
+      </w:pPr>
+      <w:r>
+        <w:rPr>
+          <w:rFonts w:eastAsia="Times New Roman"/>
+          <w:kern w:val="0"/>
+          <w:sz w:val="22"/>
+          <w:szCs w:val="22"/>
+          <w:lang w:eastAsia="pt-BR"/>
+          <w14:ligatures w14:val="none"/>
+        </w:rPr>
+        <w:t>curso,</w:t>
+      </w:r>
+    </w:p>
+    <w:p>
+      <w:pPr>
+        <w:pStyle w:val="NormalWeb"/>
         <w:numPr>
           <w:ilvl w:val="0"/>
-          <w:numId w:val="7"/>
+          <w:numId w:val="8"/>
         </w:numPr>
-      </w:pPr>
-      <w:r>
-        <w:t>Recepção: cadastros de usuários novos ou atigos, cadastras de novos planos e descrições dos planos;</w:t>
-      </w:r>
-    </w:p>
-    <w:p>
-      <w:pPr>
-        <w:numPr>
-          <w:ilvl w:val="0"/>
-          <w:numId w:val="7"/>
-        </w:numPr>
-      </w:pPr>
-      <w:r>
-        <w:t>Cada pessoa terá sua área dentro do site ou do programa: Recepção (Com os planos, descrições e cadastro de usuários), Financeiro (Visualizando a questões financeira), Professor (Vendo a frequências dos alunos), Aluno (Visualização de alguns planos, os turnos de cada professor,)</w:t>
-      </w:r>
-    </w:p>
-    <w:p>
-      <w:pPr>
-        <w:numPr>
-          <w:ilvl w:val="0"/>
-          <w:numId w:val="7"/>
-        </w:numPr>
-      </w:pPr>
-      <w:r>
-        <w:t xml:space="preserve">Horário de funcionamento: 6 </w:t>
-      </w:r>
-      <w:proofErr w:type="gramStart"/>
-      <w:r>
-        <w:t>ás</w:t>
-      </w:r>
-      <w:proofErr w:type="gramEnd"/>
-      <w:r>
-        <w:t xml:space="preserve"> 22h seg a sabado e domingo 10 ás 22h.</w:t>
-      </w:r>
-    </w:p>
-    <w:p>
-      <w:pPr>
-        <w:numPr>
-          <w:ilvl w:val="0"/>
-          <w:numId w:val="7"/>
-        </w:numPr>
-      </w:pPr>
-      <w:r>
-        <w:t>Quais são os planos:</w:t>
-      </w:r>
-    </w:p>
-    <w:p>
-      <w:pPr>
-        <w:numPr>
-          <w:ilvl w:val="0"/>
-          <w:numId w:val="7"/>
-        </w:numPr>
-      </w:pPr>
-      <w:r>
-        <w:t>Site e programa para recepção.</w:t>
-      </w:r>
-    </w:p>
-    <w:p>
-      <w:pPr>
-        <w:numPr>
-          <w:ilvl w:val="0"/>
-          <w:numId w:val="7"/>
-        </w:numPr>
-      </w:pPr>
-      <w:r>
-        <w:t>Como será o cadastro, a pessoa terá que se cadastrar para ver os planos? Não, ela pode visualizar normalmente através do site.</w:t>
-      </w:r>
-    </w:p>
-    <w:p>
-      <w:pPr>
-        <w:numPr>
-          <w:ilvl w:val="0"/>
-          <w:numId w:val="7"/>
-        </w:numPr>
-      </w:pPr>
-      <w:r>
-        <w:t xml:space="preserve">Ele está criando o site para conhecer sua academia ou fazer a venda </w:t>
-      </w:r>
-      <w:proofErr w:type="gramStart"/>
-      <w:r>
-        <w:t>dos plano</w:t>
-      </w:r>
-      <w:proofErr w:type="gramEnd"/>
-      <w:r>
-        <w:t xml:space="preserve">? Está criando para vender </w:t>
-      </w:r>
-      <w:proofErr w:type="gramStart"/>
-      <w:r>
-        <w:t>os seu plano</w:t>
-      </w:r>
-      <w:proofErr w:type="gramEnd"/>
-      <w:r>
-        <w:t xml:space="preserve"> e adquirir novo clientes.</w:t>
-      </w:r>
-    </w:p>
-    <w:p>
-      <w:pPr>
-        <w:numPr>
-          <w:ilvl w:val="0"/>
-          <w:numId w:val="7"/>
-        </w:numPr>
-      </w:pPr>
-      <w:r>
-        <w:t>Frequência e evolução dos alunos</w:t>
-      </w:r>
-    </w:p>
-    <w:p>
-      <w:pPr>
-        <w:numPr>
-          <w:ilvl w:val="0"/>
-          <w:numId w:val="7"/>
-        </w:numPr>
-      </w:pPr>
-      <w:r>
-        <w:t>Uma semana gratis</w:t>
-      </w:r>
-    </w:p>
-    <w:p>
-      <w:pPr>
-        <w:numPr>
-          <w:ilvl w:val="0"/>
-          <w:numId w:val="7"/>
-        </w:numPr>
-      </w:pPr>
-      <w:r>
-        <w:t>Você tem uma cadeira de massagem se tiver o plano a mais e um professor particular apenas agendado.</w:t>
-      </w:r>
-    </w:p>
-    <w:p>
-      <w:r>
-        <w:br/>
-      </w:r>
-      <w:r>
-        <w:br/>
-      </w:r>
-      <w:r>
-        <w:br/>
-      </w:r>
-      <w:r>
-        <w:br/>
-      </w:r>
-      <w:r>
-        <w:br/>
-      </w:r>
-      <w:r>
-        <w:br/>
-      </w:r>
-    </w:p>
-    <w:p>
-      <w:r>
-        <w:t>Academia</w:t>
-      </w:r>
-    </w:p>
-    <w:p>
-      <w:r>
-        <w:t>- Entidade</w:t>
-      </w:r>
-    </w:p>
-    <w:p>
-      <w:r>
-        <w:t>- Atributo</w:t>
-      </w:r>
-    </w:p>
-    <w:p>
+        <w:rPr>
+          <w:rFonts w:eastAsia="Times New Roman"/>
+          <w:kern w:val="0"/>
+          <w:sz w:val="22"/>
+          <w:szCs w:val="22"/>
+          <w:lang w:eastAsia="pt-BR"/>
+          <w14:ligatures w14:val="none"/>
+        </w:rPr>
+      </w:pPr>
+      <w:r>
+        <w:rPr>
+          <w:rFonts w:eastAsia="Times New Roman"/>
+          <w:kern w:val="0"/>
+          <w:sz w:val="22"/>
+          <w:szCs w:val="22"/>
+          <w:lang w:eastAsia="pt-BR"/>
+          <w14:ligatures w14:val="none"/>
+        </w:rPr>
+        <w:t>professor responsável.</w:t>
+      </w:r>
+    </w:p>
+    <w:p>
+      <w:pPr>
+        <w:pStyle w:val="NormalWeb"/>
+        <w:rPr>
+          <w:rFonts w:eastAsia="Times New Roman"/>
+          <w:kern w:val="0"/>
+          <w:sz w:val="22"/>
+          <w:szCs w:val="22"/>
+          <w:lang w:eastAsia="pt-BR"/>
+          <w14:ligatures w14:val="none"/>
+        </w:rPr>
+      </w:pPr>
+      <w:r>
+        <w:rPr>
+          <w:rFonts w:eastAsia="Times New Roman"/>
+          <w:b/>
+          <w:bCs/>
+          <w:kern w:val="0"/>
+          <w:sz w:val="22"/>
+          <w:szCs w:val="22"/>
+          <w:lang w:eastAsia="pt-BR"/>
+          <w14:ligatures w14:val="none"/>
+        </w:rPr>
+        <w:t>Pagamento</w:t>
+      </w:r>
+    </w:p>
+    <w:p>
+      <w:pPr>
+        <w:pStyle w:val="NormalWeb"/>
+        <w:rPr>
+          <w:rFonts w:eastAsia="Times New Roman"/>
+          <w:kern w:val="0"/>
+          <w:sz w:val="22"/>
+          <w:szCs w:val="22"/>
+          <w:lang w:eastAsia="pt-BR"/>
+          <w14:ligatures w14:val="none"/>
+        </w:rPr>
+      </w:pPr>
+      <w:r>
+        <w:rPr>
+          <w:rFonts w:eastAsia="Times New Roman"/>
+          <w:kern w:val="0"/>
+          <w:sz w:val="22"/>
+          <w:szCs w:val="22"/>
+          <w:lang w:eastAsia="pt-BR"/>
+          <w14:ligatures w14:val="none"/>
+        </w:rPr>
+        <w:t>- O aluno pode usar a academia por 7 dias grátis antes de pagar.</w:t>
+      </w:r>
+    </w:p>
+    <w:p>
+      <w:pPr>
+        <w:pStyle w:val="NormalWeb"/>
+        <w:rPr>
+          <w:rFonts w:eastAsia="Times New Roman"/>
+          <w:kern w:val="0"/>
+          <w:sz w:val="22"/>
+          <w:szCs w:val="22"/>
+          <w:lang w:eastAsia="pt-BR"/>
+          <w14:ligatures w14:val="none"/>
+        </w:rPr>
+      </w:pPr>
+      <w:r>
+        <w:rPr>
+          <w:rFonts w:eastAsia="Times New Roman"/>
+          <w:kern w:val="0"/>
+          <w:sz w:val="22"/>
+          <w:szCs w:val="22"/>
+          <w:lang w:eastAsia="pt-BR"/>
+          <w14:ligatures w14:val="none"/>
+        </w:rPr>
+        <w:t>- Se o cancelamento for solicitado até 30 dias após a renovação → sem multa.</w:t>
+      </w:r>
+    </w:p>
+    <w:p>
+      <w:pPr>
+        <w:pStyle w:val="NormalWeb"/>
+        <w:rPr>
+          <w:rFonts w:eastAsia="Times New Roman"/>
+          <w:kern w:val="0"/>
+          <w:sz w:val="22"/>
+          <w:szCs w:val="22"/>
+          <w:lang w:eastAsia="pt-BR"/>
+          <w14:ligatures w14:val="none"/>
+        </w:rPr>
+      </w:pPr>
+      <w:r>
+        <w:rPr>
+          <w:rFonts w:eastAsia="Times New Roman"/>
+          <w:kern w:val="0"/>
+          <w:sz w:val="22"/>
+          <w:szCs w:val="22"/>
+          <w:lang w:eastAsia="pt-BR"/>
+          <w14:ligatures w14:val="none"/>
+        </w:rPr>
+        <w:t>- Caso contrário → multa de 30% sobre o valor restante do plano.</w:t>
+      </w:r>
+    </w:p>
+    <w:p>
+      <w:pPr>
+        <w:pStyle w:val="NormalWeb"/>
+        <w:rPr>
+          <w:rFonts w:eastAsia="Times New Roman"/>
+          <w:kern w:val="0"/>
+          <w:sz w:val="22"/>
+          <w:szCs w:val="22"/>
+          <w:lang w:eastAsia="pt-BR"/>
+          <w14:ligatures w14:val="none"/>
+        </w:rPr>
+      </w:pPr>
+      <w:r>
+        <w:rPr>
+          <w:rFonts w:eastAsia="Times New Roman"/>
+          <w:b/>
+          <w:bCs/>
+          <w:kern w:val="0"/>
+          <w:sz w:val="22"/>
+          <w:szCs w:val="22"/>
+          <w:lang w:eastAsia="pt-BR"/>
+          <w14:ligatures w14:val="none"/>
+        </w:rPr>
+        <w:t>Agendamento</w:t>
+      </w:r>
+    </w:p>
+    <w:p>
+      <w:pPr>
+        <w:pStyle w:val="NormalWeb"/>
+        <w:rPr>
+          <w:rFonts w:eastAsia="Times New Roman"/>
+          <w:kern w:val="0"/>
+          <w:sz w:val="22"/>
+          <w:szCs w:val="22"/>
+          <w:lang w:eastAsia="pt-BR"/>
+          <w14:ligatures w14:val="none"/>
+        </w:rPr>
+      </w:pPr>
+      <w:r>
+        <w:rPr>
+          <w:rFonts w:eastAsia="Times New Roman"/>
+          <w:kern w:val="0"/>
+          <w:sz w:val="22"/>
+          <w:szCs w:val="22"/>
+          <w:lang w:eastAsia="pt-BR"/>
+          <w14:ligatures w14:val="none"/>
+        </w:rPr>
+        <w:t>- Somente clientes ativos ao Ouro poderá usar o agendamento com os professores, caso esteja cancelado não.</w:t>
+      </w:r>
+    </w:p>
+    <w:p>
+      <w:pPr>
+        <w:pStyle w:val="NormalWeb"/>
+        <w:rPr>
+          <w:rFonts w:eastAsia="Times New Roman"/>
+          <w:kern w:val="0"/>
+          <w:sz w:val="22"/>
+          <w:szCs w:val="22"/>
+          <w:lang w:eastAsia="pt-BR"/>
+          <w14:ligatures w14:val="none"/>
+        </w:rPr>
+      </w:pPr>
+      <w:r>
+        <w:rPr>
+          <w:rFonts w:eastAsia="Times New Roman"/>
+          <w:kern w:val="0"/>
+          <w:sz w:val="22"/>
+          <w:szCs w:val="22"/>
+          <w:lang w:eastAsia="pt-BR"/>
+          <w14:ligatures w14:val="none"/>
+        </w:rPr>
+        <w:t> - O agendamento deve estar vinculado a um aluno e a um professor.</w:t>
+      </w:r>
+    </w:p>
+    <w:p>
+      <w:pPr>
+        <w:pStyle w:val="NormalWeb"/>
+        <w:rPr>
+          <w:rFonts w:eastAsia="Times New Roman"/>
+          <w:kern w:val="0"/>
+          <w:sz w:val="22"/>
+          <w:szCs w:val="22"/>
+          <w:lang w:eastAsia="pt-BR"/>
+          <w14:ligatures w14:val="none"/>
+        </w:rPr>
+      </w:pPr>
+      <w:r>
+        <w:rPr>
+          <w:rFonts w:eastAsia="Times New Roman"/>
+          <w:kern w:val="0"/>
+          <w:sz w:val="22"/>
+          <w:szCs w:val="22"/>
+          <w:lang w:eastAsia="pt-BR"/>
+          <w14:ligatures w14:val="none"/>
+        </w:rPr>
+        <w:t>- O aluno pode agendar encontros com professores pelo site da academia.</w:t>
+      </w:r>
+    </w:p>
+    <w:p>
+      <w:pPr>
+        <w:pStyle w:val="NormalWeb"/>
+        <w:rPr>
+          <w:rFonts w:eastAsia="Times New Roman"/>
+          <w:kern w:val="0"/>
+          <w:sz w:val="22"/>
+          <w:szCs w:val="22"/>
+          <w:lang w:eastAsia="pt-BR"/>
+          <w14:ligatures w14:val="none"/>
+        </w:rPr>
+      </w:pPr>
+      <w:r>
+        <w:rPr>
+          <w:rFonts w:eastAsia="Times New Roman"/>
+          <w:kern w:val="0"/>
+          <w:sz w:val="22"/>
+          <w:szCs w:val="22"/>
+          <w:lang w:eastAsia="pt-BR"/>
+          <w14:ligatures w14:val="none"/>
+        </w:rPr>
+        <w:t>- Plano Ouro:</w:t>
+      </w:r>
+    </w:p>
+    <w:p>
+      <w:pPr>
+        <w:pStyle w:val="NormalWeb"/>
+        <w:rPr>
+          <w:rFonts w:eastAsia="Times New Roman"/>
+          <w:kern w:val="0"/>
+          <w:sz w:val="22"/>
+          <w:szCs w:val="22"/>
+          <w:lang w:eastAsia="pt-BR"/>
+          <w14:ligatures w14:val="none"/>
+        </w:rPr>
+      </w:pPr>
+      <w:r>
+        <w:rPr>
+          <w:rFonts w:eastAsia="Times New Roman"/>
+          <w:kern w:val="0"/>
+          <w:sz w:val="22"/>
+          <w:szCs w:val="22"/>
+          <w:lang w:eastAsia="pt-BR"/>
+          <w14:ligatures w14:val="none"/>
+        </w:rPr>
+        <w:t>Nesse plano, há a possibilidade de agendamento exclusivo com professor particular.</w:t>
+      </w:r>
+    </w:p>
+    <w:p>
+      <w:pPr>
+        <w:pStyle w:val="NormalWeb"/>
+        <w:rPr>
+          <w:rFonts w:eastAsia="Times New Roman"/>
+          <w:kern w:val="0"/>
+          <w:sz w:val="22"/>
+          <w:szCs w:val="22"/>
+          <w:lang w:eastAsia="pt-BR"/>
+          <w14:ligatures w14:val="none"/>
+        </w:rPr>
+      </w:pPr>
+      <w:r>
+        <w:rPr>
+          <w:rFonts w:eastAsia="Times New Roman"/>
+          <w:kern w:val="0"/>
+          <w:sz w:val="22"/>
+          <w:szCs w:val="22"/>
+          <w:lang w:eastAsia="pt-BR"/>
+          <w14:ligatures w14:val="none"/>
+        </w:rPr>
+        <w:t> </w:t>
+      </w:r>
+    </w:p>
+    <w:p>
+      <w:pPr>
+        <w:pStyle w:val="NormalWeb"/>
+        <w:rPr>
+          <w:rFonts w:eastAsia="Times New Roman"/>
+          <w:kern w:val="0"/>
+          <w:sz w:val="22"/>
+          <w:szCs w:val="22"/>
+          <w:lang w:eastAsia="pt-BR"/>
+          <w14:ligatures w14:val="none"/>
+        </w:rPr>
+      </w:pPr>
+      <w:r>
+        <w:rPr>
+          <w:rFonts w:eastAsia="Times New Roman"/>
+          <w:b/>
+          <w:bCs/>
+          <w:kern w:val="0"/>
+          <w:sz w:val="22"/>
+          <w:szCs w:val="22"/>
+          <w:lang w:eastAsia="pt-BR"/>
+          <w14:ligatures w14:val="none"/>
+        </w:rPr>
+        <w:t>Matricula</w:t>
+      </w:r>
+    </w:p>
+    <w:p>
+      <w:pPr>
+        <w:pStyle w:val="NormalWeb"/>
+        <w:rPr>
+          <w:rFonts w:eastAsia="Times New Roman"/>
+          <w:kern w:val="0"/>
+          <w:sz w:val="22"/>
+          <w:szCs w:val="22"/>
+          <w:lang w:eastAsia="pt-BR"/>
+          <w14:ligatures w14:val="none"/>
+        </w:rPr>
+      </w:pPr>
+      <w:r>
+        <w:rPr>
+          <w:rFonts w:eastAsia="Times New Roman"/>
+          <w:kern w:val="0"/>
+          <w:sz w:val="22"/>
+          <w:szCs w:val="22"/>
+          <w:lang w:eastAsia="pt-BR"/>
+          <w14:ligatures w14:val="none"/>
+        </w:rPr>
+        <w:t>- Uma matrícula precisa estar associada a um aluno e a um plano.</w:t>
+      </w:r>
+    </w:p>
+    <w:p>
+      <w:pPr>
+        <w:pStyle w:val="NormalWeb"/>
+        <w:rPr>
+          <w:rFonts w:eastAsia="Times New Roman"/>
+          <w:kern w:val="0"/>
+          <w:sz w:val="22"/>
+          <w:szCs w:val="22"/>
+          <w:lang w:eastAsia="pt-BR"/>
+          <w14:ligatures w14:val="none"/>
+        </w:rPr>
+      </w:pPr>
+      <w:r>
+        <w:rPr>
+          <w:rFonts w:eastAsia="Times New Roman"/>
+          <w:kern w:val="0"/>
+          <w:sz w:val="22"/>
+          <w:szCs w:val="22"/>
+          <w:lang w:eastAsia="pt-BR"/>
+          <w14:ligatures w14:val="none"/>
+        </w:rPr>
+        <w:t>- O sistema deve prever a renovação da matrícula (especialmente nos planos anuais).</w:t>
+      </w:r>
+    </w:p>
+    <w:p>
+      <w:pPr>
+        <w:pStyle w:val="NormalWeb"/>
+        <w:rPr>
+          <w:rFonts w:eastAsia="Times New Roman"/>
+          <w:kern w:val="0"/>
+          <w:sz w:val="22"/>
+          <w:szCs w:val="22"/>
+          <w:lang w:eastAsia="pt-BR"/>
+          <w14:ligatures w14:val="none"/>
+        </w:rPr>
+      </w:pPr>
+      <w:r>
+        <w:rPr>
+          <w:rFonts w:eastAsia="Times New Roman"/>
+          <w:kern w:val="0"/>
+          <w:sz w:val="22"/>
+          <w:szCs w:val="22"/>
+          <w:lang w:eastAsia="pt-BR"/>
+          <w14:ligatures w14:val="none"/>
+        </w:rPr>
+        <w:lastRenderedPageBreak/>
+        <w:t>- Caso o aluno não pague, a matrícula pode ser suspensa ou cancelada.</w:t>
+      </w:r>
+    </w:p>
+    <w:p>
+      <w:pPr>
+        <w:pStyle w:val="NormalWeb"/>
+        <w:rPr>
+          <w:rFonts w:eastAsia="Times New Roman"/>
+          <w:kern w:val="0"/>
+          <w:sz w:val="22"/>
+          <w:szCs w:val="22"/>
+          <w:lang w:eastAsia="pt-BR"/>
+          <w14:ligatures w14:val="none"/>
+        </w:rPr>
+      </w:pPr>
+      <w:r>
+        <w:rPr>
+          <w:rFonts w:eastAsia="Times New Roman"/>
+          <w:b/>
+          <w:bCs/>
+          <w:kern w:val="0"/>
+          <w:sz w:val="22"/>
+          <w:szCs w:val="22"/>
+          <w:lang w:eastAsia="pt-BR"/>
+          <w14:ligatures w14:val="none"/>
+        </w:rPr>
+        <w:t>Turma</w:t>
+      </w:r>
+    </w:p>
+    <w:p>
+      <w:pPr>
+        <w:pStyle w:val="NormalWeb"/>
+        <w:rPr>
+          <w:rFonts w:eastAsia="Times New Roman"/>
+          <w:kern w:val="0"/>
+          <w:sz w:val="22"/>
+          <w:szCs w:val="22"/>
+          <w:lang w:eastAsia="pt-BR"/>
+          <w14:ligatures w14:val="none"/>
+        </w:rPr>
+      </w:pPr>
+      <w:r>
+        <w:rPr>
+          <w:rFonts w:eastAsia="Times New Roman"/>
+          <w:kern w:val="0"/>
+          <w:sz w:val="22"/>
+          <w:szCs w:val="22"/>
+          <w:lang w:eastAsia="pt-BR"/>
+          <w14:ligatures w14:val="none"/>
+        </w:rPr>
+        <w:t>- Conterá todos os alunos cadastrados em determinadas modalidades</w:t>
+      </w:r>
+    </w:p>
+    <w:p>
+      <w:pPr>
+        <w:pStyle w:val="NormalWeb"/>
+        <w:rPr>
+          <w:rFonts w:eastAsia="Times New Roman"/>
+          <w:kern w:val="0"/>
+          <w:sz w:val="22"/>
+          <w:szCs w:val="22"/>
+          <w:lang w:eastAsia="pt-BR"/>
+          <w14:ligatures w14:val="none"/>
+        </w:rPr>
+      </w:pPr>
+      <w:r>
+        <w:rPr>
+          <w:rFonts w:eastAsia="Times New Roman"/>
+          <w:kern w:val="0"/>
+          <w:sz w:val="22"/>
+          <w:szCs w:val="22"/>
+          <w:lang w:eastAsia="pt-BR"/>
+          <w14:ligatures w14:val="none"/>
+        </w:rPr>
+        <w:t>- Verificar o professor que dará aula para aquela turma</w:t>
+      </w:r>
+    </w:p>
+    <w:p>
+      <w:pPr>
+        <w:pStyle w:val="NormalWeb"/>
+        <w:rPr>
+          <w:rFonts w:eastAsia="Times New Roman"/>
+          <w:kern w:val="0"/>
+          <w:sz w:val="22"/>
+          <w:szCs w:val="22"/>
+          <w:lang w:eastAsia="pt-BR"/>
+          <w14:ligatures w14:val="none"/>
+        </w:rPr>
+      </w:pPr>
+      <w:r>
+        <w:rPr>
+          <w:rFonts w:eastAsia="Times New Roman"/>
+          <w:kern w:val="0"/>
+          <w:sz w:val="22"/>
+          <w:szCs w:val="22"/>
+          <w:lang w:eastAsia="pt-BR"/>
+          <w14:ligatures w14:val="none"/>
+        </w:rPr>
+        <w:t>- Horário de cada turma</w:t>
+      </w:r>
+    </w:p>
+    <w:p>
+      <w:pPr>
+        <w:pStyle w:val="NormalWeb"/>
+        <w:rPr>
+          <w:rFonts w:eastAsia="Times New Roman"/>
+          <w:kern w:val="0"/>
+          <w:sz w:val="22"/>
+          <w:szCs w:val="22"/>
+          <w:lang w:eastAsia="pt-BR"/>
+          <w14:ligatures w14:val="none"/>
+        </w:rPr>
+      </w:pPr>
+      <w:r>
+        <w:rPr>
+          <w:rFonts w:eastAsia="Times New Roman"/>
+          <w:kern w:val="0"/>
+          <w:sz w:val="22"/>
+          <w:szCs w:val="22"/>
+          <w:lang w:eastAsia="pt-BR"/>
+          <w14:ligatures w14:val="none"/>
+        </w:rPr>
+        <w:t> </w:t>
+      </w:r>
+    </w:p>
+    <w:p>
+      <w:pPr>
+        <w:pStyle w:val="NormalWeb"/>
+        <w:rPr>
+          <w:rFonts w:eastAsia="Times New Roman"/>
+          <w:kern w:val="0"/>
+          <w:sz w:val="22"/>
+          <w:szCs w:val="22"/>
+          <w:lang w:eastAsia="pt-BR"/>
+          <w14:ligatures w14:val="none"/>
+        </w:rPr>
+      </w:pPr>
+      <w:r>
+        <w:rPr>
+          <w:rFonts w:eastAsia="Times New Roman"/>
+          <w:b/>
+          <w:bCs/>
+          <w:kern w:val="0"/>
+          <w:sz w:val="22"/>
+          <w:szCs w:val="22"/>
+          <w:lang w:eastAsia="pt-BR"/>
+          <w14:ligatures w14:val="none"/>
+        </w:rPr>
+        <w:t>Frequência</w:t>
+      </w:r>
+    </w:p>
+    <w:p>
+      <w:pPr>
+        <w:pStyle w:val="NormalWeb"/>
+        <w:rPr>
+          <w:rFonts w:eastAsia="Times New Roman"/>
+          <w:kern w:val="0"/>
+          <w:sz w:val="22"/>
+          <w:szCs w:val="22"/>
+          <w:lang w:eastAsia="pt-BR"/>
+          <w14:ligatures w14:val="none"/>
+        </w:rPr>
+      </w:pPr>
+      <w:r>
+        <w:rPr>
+          <w:rFonts w:eastAsia="Times New Roman"/>
+          <w:kern w:val="0"/>
+          <w:sz w:val="22"/>
+          <w:szCs w:val="22"/>
+          <w:lang w:eastAsia="pt-BR"/>
+          <w14:ligatures w14:val="none"/>
+        </w:rPr>
+        <w:t xml:space="preserve">- Cada frequência </w:t>
+      </w:r>
+      <w:proofErr w:type="spellStart"/>
+      <w:r>
+        <w:rPr>
+          <w:rFonts w:eastAsia="Times New Roman"/>
+          <w:kern w:val="0"/>
+          <w:sz w:val="22"/>
+          <w:szCs w:val="22"/>
+          <w:lang w:eastAsia="pt-BR"/>
+          <w14:ligatures w14:val="none"/>
+        </w:rPr>
+        <w:t>esta</w:t>
+      </w:r>
+      <w:proofErr w:type="spellEnd"/>
+      <w:r>
+        <w:rPr>
+          <w:rFonts w:eastAsia="Times New Roman"/>
+          <w:kern w:val="0"/>
+          <w:sz w:val="22"/>
+          <w:szCs w:val="22"/>
+          <w:lang w:eastAsia="pt-BR"/>
+          <w14:ligatures w14:val="none"/>
+        </w:rPr>
+        <w:t xml:space="preserve"> vinculada aos alunos ativos</w:t>
+      </w:r>
+    </w:p>
+    <w:p>
+      <w:pPr>
+        <w:pStyle w:val="NormalWeb"/>
+        <w:rPr>
+          <w:rFonts w:eastAsia="Times New Roman"/>
+          <w:kern w:val="0"/>
+          <w:sz w:val="22"/>
+          <w:szCs w:val="22"/>
+          <w:lang w:eastAsia="pt-BR"/>
+          <w14:ligatures w14:val="none"/>
+        </w:rPr>
+      </w:pPr>
+      <w:r>
+        <w:rPr>
+          <w:rFonts w:eastAsia="Times New Roman"/>
+          <w:kern w:val="0"/>
+          <w:sz w:val="22"/>
+          <w:szCs w:val="22"/>
+          <w:lang w:eastAsia="pt-BR"/>
+          <w14:ligatures w14:val="none"/>
+        </w:rPr>
+        <w:t>- A frequência iria dizer em qual modalidade/turma o aluno esteve presente</w:t>
+      </w:r>
+    </w:p>
+    <w:p>
+      <w:pPr>
+        <w:pStyle w:val="NormalWeb"/>
+        <w:rPr>
+          <w:rFonts w:eastAsia="Times New Roman"/>
+          <w:kern w:val="0"/>
+          <w:sz w:val="22"/>
+          <w:szCs w:val="22"/>
+          <w:lang w:eastAsia="pt-BR"/>
+          <w14:ligatures w14:val="none"/>
+        </w:rPr>
+      </w:pPr>
+      <w:r>
+        <w:rPr>
+          <w:rFonts w:eastAsia="Times New Roman"/>
+          <w:kern w:val="0"/>
+          <w:sz w:val="22"/>
+          <w:szCs w:val="22"/>
+          <w:lang w:eastAsia="pt-BR"/>
+          <w14:ligatures w14:val="none"/>
+        </w:rPr>
+        <w:t xml:space="preserve">- A frequência deve ter data e horário de </w:t>
+      </w:r>
+      <w:proofErr w:type="spellStart"/>
+      <w:r>
+        <w:rPr>
+          <w:rFonts w:eastAsia="Times New Roman"/>
+          <w:kern w:val="0"/>
+          <w:sz w:val="22"/>
+          <w:szCs w:val="22"/>
+          <w:lang w:eastAsia="pt-BR"/>
+          <w14:ligatures w14:val="none"/>
+        </w:rPr>
+        <w:t>netrada</w:t>
+      </w:r>
+      <w:proofErr w:type="spellEnd"/>
+      <w:r>
+        <w:rPr>
+          <w:rFonts w:eastAsia="Times New Roman"/>
+          <w:kern w:val="0"/>
+          <w:sz w:val="22"/>
+          <w:szCs w:val="22"/>
+          <w:lang w:eastAsia="pt-BR"/>
+          <w14:ligatures w14:val="none"/>
+        </w:rPr>
+        <w:t xml:space="preserve"> do aluno</w:t>
+      </w:r>
+    </w:p>
+    <w:p>
+      <w:pPr>
+        <w:pStyle w:val="NormalWeb"/>
+        <w:rPr>
+          <w:rFonts w:eastAsia="Times New Roman"/>
+          <w:kern w:val="0"/>
+          <w:sz w:val="22"/>
+          <w:szCs w:val="22"/>
+          <w:lang w:eastAsia="pt-BR"/>
+          <w14:ligatures w14:val="none"/>
+        </w:rPr>
+      </w:pPr>
+      <w:r>
+        <w:rPr>
+          <w:rFonts w:eastAsia="Times New Roman"/>
+          <w:kern w:val="0"/>
+          <w:sz w:val="22"/>
+          <w:szCs w:val="22"/>
+          <w:lang w:eastAsia="pt-BR"/>
+          <w14:ligatures w14:val="none"/>
+        </w:rPr>
+        <w:t>- O professor pode visualizar a frequência dos alunos em sua turma</w:t>
+      </w:r>
+    </w:p>
+    <w:p>
+      <w:pPr>
+        <w:pStyle w:val="NormalWeb"/>
+        <w:rPr>
+          <w:rFonts w:eastAsia="Times New Roman"/>
+          <w:kern w:val="0"/>
+          <w:sz w:val="22"/>
+          <w:szCs w:val="22"/>
+          <w:lang w:eastAsia="pt-BR"/>
+          <w14:ligatures w14:val="none"/>
+        </w:rPr>
+      </w:pPr>
+      <w:r>
+        <w:rPr>
+          <w:rFonts w:eastAsia="Times New Roman"/>
+          <w:b/>
+          <w:bCs/>
+          <w:kern w:val="0"/>
+          <w:sz w:val="22"/>
+          <w:szCs w:val="22"/>
+          <w:lang w:eastAsia="pt-BR"/>
+          <w14:ligatures w14:val="none"/>
+        </w:rPr>
+        <w:t>Cancelamento de Plano</w:t>
+      </w:r>
+    </w:p>
+    <w:p>
+      <w:pPr>
+        <w:pStyle w:val="NormalWeb"/>
+        <w:rPr>
+          <w:rFonts w:eastAsia="Times New Roman"/>
+          <w:kern w:val="0"/>
+          <w:sz w:val="22"/>
+          <w:szCs w:val="22"/>
+          <w:lang w:eastAsia="pt-BR"/>
+          <w14:ligatures w14:val="none"/>
+        </w:rPr>
+      </w:pPr>
+      <w:r>
+        <w:rPr>
+          <w:rFonts w:eastAsia="Times New Roman"/>
+          <w:kern w:val="0"/>
+          <w:sz w:val="22"/>
+          <w:szCs w:val="22"/>
+          <w:lang w:eastAsia="pt-BR"/>
+          <w14:ligatures w14:val="none"/>
+        </w:rPr>
+        <w:t>- Terá um período de 30 dias para cancelar o plano após a renovação.</w:t>
+      </w:r>
+    </w:p>
+    <w:p>
+      <w:pPr>
+        <w:pStyle w:val="NormalWeb"/>
+        <w:rPr>
+          <w:rFonts w:eastAsia="Times New Roman"/>
+          <w:kern w:val="0"/>
+          <w:sz w:val="22"/>
+          <w:szCs w:val="22"/>
+          <w:lang w:eastAsia="pt-BR"/>
+          <w14:ligatures w14:val="none"/>
+        </w:rPr>
+      </w:pPr>
+      <w:r>
+        <w:rPr>
+          <w:rFonts w:eastAsia="Times New Roman"/>
+          <w:kern w:val="0"/>
+          <w:sz w:val="22"/>
+          <w:szCs w:val="22"/>
+          <w:lang w:eastAsia="pt-BR"/>
+          <w14:ligatures w14:val="none"/>
+        </w:rPr>
+        <w:t xml:space="preserve">- Caso deseja o cancelamento após esse </w:t>
+      </w:r>
+      <w:proofErr w:type="spellStart"/>
+      <w:r>
+        <w:rPr>
+          <w:rFonts w:eastAsia="Times New Roman"/>
+          <w:kern w:val="0"/>
+          <w:sz w:val="22"/>
+          <w:szCs w:val="22"/>
+          <w:lang w:eastAsia="pt-BR"/>
+          <w14:ligatures w14:val="none"/>
+        </w:rPr>
+        <w:t>periodo</w:t>
+      </w:r>
+      <w:proofErr w:type="spellEnd"/>
+      <w:r>
+        <w:rPr>
+          <w:rFonts w:eastAsia="Times New Roman"/>
+          <w:kern w:val="0"/>
+          <w:sz w:val="22"/>
+          <w:szCs w:val="22"/>
+          <w:lang w:eastAsia="pt-BR"/>
+          <w14:ligatures w14:val="none"/>
+        </w:rPr>
+        <w:t>, terá que pagar com 30% de multa.</w:t>
+      </w:r>
+    </w:p>
+    <w:p>
+      <w:pPr>
+        <w:pStyle w:val="NormalWeb"/>
+        <w:rPr>
+          <w:rFonts w:eastAsia="Times New Roman"/>
+          <w:kern w:val="0"/>
+          <w:sz w:val="22"/>
+          <w:szCs w:val="22"/>
+          <w:lang w:eastAsia="pt-BR"/>
+          <w14:ligatures w14:val="none"/>
+        </w:rPr>
+      </w:pPr>
+      <w:r>
+        <w:rPr>
+          <w:rFonts w:eastAsia="Times New Roman"/>
+          <w:b/>
+          <w:bCs/>
+          <w:i/>
+          <w:iCs/>
+          <w:kern w:val="0"/>
+          <w:sz w:val="22"/>
+          <w:szCs w:val="22"/>
+          <w:lang w:eastAsia="pt-BR"/>
+          <w14:ligatures w14:val="none"/>
+        </w:rPr>
+        <w:t>Entidades:</w:t>
+      </w:r>
+    </w:p>
+    <w:p>
+      <w:pPr>
+        <w:pStyle w:val="NormalWeb"/>
+        <w:rPr>
+          <w:rFonts w:eastAsia="Times New Roman"/>
+          <w:kern w:val="0"/>
+          <w:sz w:val="22"/>
+          <w:szCs w:val="22"/>
+          <w:lang w:eastAsia="pt-BR"/>
+          <w14:ligatures w14:val="none"/>
+        </w:rPr>
+      </w:pPr>
+      <w:r>
+        <w:rPr>
+          <w:rFonts w:eastAsia="Times New Roman"/>
+          <w:kern w:val="0"/>
+          <w:sz w:val="22"/>
+          <w:szCs w:val="22"/>
+          <w:lang w:eastAsia="pt-BR"/>
+          <w14:ligatures w14:val="none"/>
+        </w:rPr>
+        <w:t>Aluno</w:t>
+      </w:r>
+    </w:p>
+    <w:p>
+      <w:pPr>
+        <w:pStyle w:val="NormalWeb"/>
+        <w:rPr>
+          <w:rFonts w:eastAsia="Times New Roman"/>
+          <w:kern w:val="0"/>
+          <w:sz w:val="22"/>
+          <w:szCs w:val="22"/>
+          <w:lang w:eastAsia="pt-BR"/>
+          <w14:ligatures w14:val="none"/>
+        </w:rPr>
+      </w:pPr>
+      <w:r>
+        <w:rPr>
+          <w:rFonts w:eastAsia="Times New Roman"/>
+          <w:kern w:val="0"/>
+          <w:sz w:val="22"/>
+          <w:szCs w:val="22"/>
+          <w:lang w:eastAsia="pt-BR"/>
+          <w14:ligatures w14:val="none"/>
+        </w:rPr>
+        <w:t>Recepcionista</w:t>
+      </w:r>
+    </w:p>
+    <w:p>
+      <w:pPr>
+        <w:pStyle w:val="NormalWeb"/>
+        <w:rPr>
+          <w:rFonts w:eastAsia="Times New Roman"/>
+          <w:kern w:val="0"/>
+          <w:sz w:val="22"/>
+          <w:szCs w:val="22"/>
+          <w:lang w:eastAsia="pt-BR"/>
+          <w14:ligatures w14:val="none"/>
+        </w:rPr>
+      </w:pPr>
+      <w:r>
+        <w:rPr>
+          <w:rFonts w:eastAsia="Times New Roman"/>
+          <w:kern w:val="0"/>
+          <w:sz w:val="22"/>
+          <w:szCs w:val="22"/>
+          <w:lang w:eastAsia="pt-BR"/>
+          <w14:ligatures w14:val="none"/>
+        </w:rPr>
+        <w:t>Professor</w:t>
+      </w:r>
+    </w:p>
+    <w:p>
+      <w:pPr>
+        <w:pStyle w:val="NormalWeb"/>
+        <w:rPr>
+          <w:rFonts w:eastAsia="Times New Roman"/>
+          <w:kern w:val="0"/>
+          <w:sz w:val="22"/>
+          <w:szCs w:val="22"/>
+          <w:lang w:eastAsia="pt-BR"/>
+          <w14:ligatures w14:val="none"/>
+        </w:rPr>
+      </w:pPr>
+      <w:r>
+        <w:rPr>
+          <w:rFonts w:eastAsia="Times New Roman"/>
+          <w:kern w:val="0"/>
+          <w:sz w:val="22"/>
+          <w:szCs w:val="22"/>
+          <w:lang w:eastAsia="pt-BR"/>
+          <w14:ligatures w14:val="none"/>
+        </w:rPr>
+        <w:t>Plano</w:t>
+      </w:r>
+    </w:p>
+    <w:p>
+      <w:pPr>
+        <w:pStyle w:val="NormalWeb"/>
+        <w:rPr>
+          <w:rFonts w:eastAsia="Times New Roman"/>
+          <w:kern w:val="0"/>
+          <w:sz w:val="22"/>
+          <w:szCs w:val="22"/>
+          <w:lang w:eastAsia="pt-BR"/>
+          <w14:ligatures w14:val="none"/>
+        </w:rPr>
+      </w:pPr>
+      <w:r>
+        <w:rPr>
+          <w:rFonts w:eastAsia="Times New Roman"/>
+          <w:kern w:val="0"/>
+          <w:sz w:val="22"/>
+          <w:szCs w:val="22"/>
+          <w:lang w:eastAsia="pt-BR"/>
+          <w14:ligatures w14:val="none"/>
+        </w:rPr>
+        <w:t>Modalidades</w:t>
+      </w:r>
+    </w:p>
+    <w:p>
+      <w:pPr>
+        <w:pStyle w:val="NormalWeb"/>
+        <w:rPr>
+          <w:rFonts w:eastAsia="Times New Roman"/>
+          <w:kern w:val="0"/>
+          <w:sz w:val="22"/>
+          <w:szCs w:val="22"/>
+          <w:lang w:eastAsia="pt-BR"/>
+          <w14:ligatures w14:val="none"/>
+        </w:rPr>
+      </w:pPr>
+      <w:r>
+        <w:rPr>
+          <w:rFonts w:eastAsia="Times New Roman"/>
+          <w:kern w:val="0"/>
+          <w:sz w:val="22"/>
+          <w:szCs w:val="22"/>
+          <w:lang w:eastAsia="pt-BR"/>
+          <w14:ligatures w14:val="none"/>
+        </w:rPr>
+        <w:t>Cursos Livres</w:t>
+      </w:r>
+    </w:p>
+    <w:p>
+      <w:pPr>
+        <w:pStyle w:val="NormalWeb"/>
+        <w:rPr>
+          <w:rFonts w:eastAsia="Times New Roman"/>
+          <w:kern w:val="0"/>
+          <w:sz w:val="22"/>
+          <w:szCs w:val="22"/>
+          <w:lang w:eastAsia="pt-BR"/>
+          <w14:ligatures w14:val="none"/>
+        </w:rPr>
+      </w:pPr>
+      <w:r>
+        <w:rPr>
+          <w:rFonts w:eastAsia="Times New Roman"/>
+          <w:kern w:val="0"/>
+          <w:sz w:val="22"/>
+          <w:szCs w:val="22"/>
+          <w:lang w:eastAsia="pt-BR"/>
+          <w14:ligatures w14:val="none"/>
+        </w:rPr>
+        <w:t>Pagamento</w:t>
+      </w:r>
+    </w:p>
+    <w:p>
+      <w:pPr>
+        <w:pStyle w:val="NormalWeb"/>
+        <w:rPr>
+          <w:rFonts w:eastAsia="Times New Roman"/>
+          <w:kern w:val="0"/>
+          <w:sz w:val="22"/>
+          <w:szCs w:val="22"/>
+          <w:lang w:eastAsia="pt-BR"/>
+          <w14:ligatures w14:val="none"/>
+        </w:rPr>
+      </w:pPr>
+      <w:r>
+        <w:rPr>
+          <w:rFonts w:eastAsia="Times New Roman"/>
+          <w:kern w:val="0"/>
+          <w:sz w:val="22"/>
+          <w:szCs w:val="22"/>
+          <w:lang w:eastAsia="pt-BR"/>
+          <w14:ligatures w14:val="none"/>
+        </w:rPr>
+        <w:t>Agendamento</w:t>
+      </w:r>
+    </w:p>
+    <w:p>
+      <w:pPr>
+        <w:pStyle w:val="NormalWeb"/>
+        <w:rPr>
+          <w:rFonts w:eastAsia="Times New Roman"/>
+          <w:kern w:val="0"/>
+          <w:sz w:val="22"/>
+          <w:szCs w:val="22"/>
+          <w:lang w:eastAsia="pt-BR"/>
+          <w14:ligatures w14:val="none"/>
+        </w:rPr>
+      </w:pPr>
+      <w:r>
+        <w:rPr>
+          <w:rFonts w:eastAsia="Times New Roman"/>
+          <w:kern w:val="0"/>
+          <w:sz w:val="22"/>
+          <w:szCs w:val="22"/>
+          <w:lang w:eastAsia="pt-BR"/>
+          <w14:ligatures w14:val="none"/>
+        </w:rPr>
+        <w:t>Matricula</w:t>
+      </w:r>
+    </w:p>
+    <w:p>
+      <w:pPr>
+        <w:pStyle w:val="NormalWeb"/>
+        <w:rPr>
+          <w:rFonts w:eastAsia="Times New Roman"/>
+          <w:kern w:val="0"/>
+          <w:sz w:val="22"/>
+          <w:szCs w:val="22"/>
+          <w:lang w:eastAsia="pt-BR"/>
+          <w14:ligatures w14:val="none"/>
+        </w:rPr>
+      </w:pPr>
+      <w:r>
+        <w:rPr>
+          <w:rFonts w:eastAsia="Times New Roman"/>
+          <w:kern w:val="0"/>
+          <w:sz w:val="22"/>
+          <w:szCs w:val="22"/>
+          <w:lang w:eastAsia="pt-BR"/>
+          <w14:ligatures w14:val="none"/>
+        </w:rPr>
+        <w:t>Frequência</w:t>
+      </w:r>
+    </w:p>
+    <w:p>
+      <w:pPr>
+        <w:pStyle w:val="NormalWeb"/>
+        <w:rPr>
+          <w:rFonts w:eastAsia="Times New Roman"/>
+          <w:kern w:val="0"/>
+          <w:sz w:val="22"/>
+          <w:szCs w:val="22"/>
+          <w:lang w:eastAsia="pt-BR"/>
+          <w14:ligatures w14:val="none"/>
+        </w:rPr>
+      </w:pPr>
+      <w:r>
+        <w:rPr>
+          <w:rFonts w:eastAsia="Times New Roman"/>
+          <w:kern w:val="0"/>
+          <w:sz w:val="22"/>
+          <w:szCs w:val="22"/>
+          <w:lang w:eastAsia="pt-BR"/>
+          <w14:ligatures w14:val="none"/>
+        </w:rPr>
+        <w:t>Turma</w:t>
+      </w:r>
+    </w:p>
+    <w:p>
+      <w:pPr>
+        <w:pStyle w:val="NormalWeb"/>
+        <w:rPr>
+          <w:rFonts w:eastAsia="Times New Roman"/>
+          <w:kern w:val="0"/>
+          <w:sz w:val="22"/>
+          <w:szCs w:val="22"/>
+          <w:lang w:eastAsia="pt-BR"/>
+          <w14:ligatures w14:val="none"/>
+        </w:rPr>
+      </w:pPr>
+      <w:r>
+        <w:rPr>
+          <w:rFonts w:eastAsia="Times New Roman"/>
+          <w:kern w:val="0"/>
+          <w:sz w:val="22"/>
+          <w:szCs w:val="22"/>
+          <w:lang w:eastAsia="pt-BR"/>
+          <w14:ligatures w14:val="none"/>
+        </w:rPr>
+        <w:t>Cancelamento</w:t>
+      </w:r>
+    </w:p>
+    <w:p>
+      <w:pPr>
+        <w:pStyle w:val="NormalWeb"/>
+      </w:pPr>
       <w:r>
         <w:t>1. Aluno</w:t>
       </w:r>
@@ -723,9 +2845,11 @@
           <w:numId w:val="2"/>
         </w:numPr>
       </w:pPr>
+      <w:proofErr w:type="spellStart"/>
       <w:r>
         <w:t>ID_Aluno</w:t>
       </w:r>
+      <w:proofErr w:type="spellEnd"/>
       <w:r>
         <w:t xml:space="preserve"> (PK)</w:t>
       </w:r>
@@ -739,7 +2863,6 @@
         </w:numPr>
       </w:pPr>
       <w:r>
-        <w:lastRenderedPageBreak/>
         <w:t>Nome</w:t>
       </w:r>
     </w:p>
@@ -764,6 +2887,7 @@
         </w:numPr>
       </w:pPr>
       <w:r>
+        <w:lastRenderedPageBreak/>
         <w:t>E-mail</w:t>
       </w:r>
     </w:p>
@@ -792,9 +2916,11 @@
           <w:numId w:val="3"/>
         </w:numPr>
       </w:pPr>
+      <w:proofErr w:type="spellStart"/>
       <w:r>
         <w:t>ID_Plano</w:t>
       </w:r>
+      <w:proofErr w:type="spellEnd"/>
       <w:r>
         <w:t xml:space="preserve"> (PK)</w:t>
       </w:r>
@@ -848,9 +2974,11 @@
           <w:numId w:val="4"/>
         </w:numPr>
       </w:pPr>
+      <w:proofErr w:type="spellStart"/>
       <w:r>
         <w:t>ID_Aluno</w:t>
       </w:r>
+      <w:proofErr w:type="spellEnd"/>
       <w:r>
         <w:t xml:space="preserve"> (FK</w:t>
       </w:r>
@@ -869,9 +2997,11 @@
           <w:numId w:val="4"/>
         </w:numPr>
       </w:pPr>
+      <w:proofErr w:type="spellStart"/>
       <w:r>
         <w:t>ID_plano</w:t>
       </w:r>
+      <w:proofErr w:type="spellEnd"/>
       <w:r>
         <w:t xml:space="preserve"> (FK</w:t>
       </w:r>
@@ -919,9 +3049,11 @@
           <w:numId w:val="5"/>
         </w:numPr>
       </w:pPr>
+      <w:proofErr w:type="spellStart"/>
       <w:r>
         <w:t>ID_Professor</w:t>
       </w:r>
+      <w:proofErr w:type="spellEnd"/>
       <w:r>
         <w:t xml:space="preserve"> (PK)</w:t>
       </w:r>
@@ -978,9 +3110,11 @@
           <w:numId w:val="6"/>
         </w:numPr>
       </w:pPr>
+      <w:proofErr w:type="spellStart"/>
       <w:r>
         <w:t>ID_Frequencia</w:t>
       </w:r>
+      <w:proofErr w:type="spellEnd"/>
       <w:r>
         <w:t xml:space="preserve"> (PK)</w:t>
       </w:r>
@@ -1094,13 +3228,23 @@
           <w:lang w:val="en-US"/>
         </w:rPr>
       </w:pPr>
+      <w:proofErr w:type="spellStart"/>
       <w:r>
         <w:rPr>
           <w:b/>
           <w:bCs/>
           <w:lang w:val="en-US"/>
         </w:rPr>
-        <w:t>Dicionário de Dados</w:t>
+        <w:t>Dicionário</w:t>
+      </w:r>
+      <w:proofErr w:type="spellEnd"/>
+      <w:r>
+        <w:rPr>
+          <w:b/>
+          <w:bCs/>
+          <w:lang w:val="en-US"/>
+        </w:rPr>
+        <w:t xml:space="preserve"> de Dados</w:t>
       </w:r>
       <w:r>
         <w:rPr>
@@ -1171,6 +3315,7 @@
                 <w:lang w:val="en-US"/>
               </w:rPr>
             </w:pPr>
+            <w:proofErr w:type="spellStart"/>
             <w:r>
               <w:rPr>
                 <w:b/>
@@ -1179,6 +3324,7 @@
               </w:rPr>
               <w:t>Tabela</w:t>
             </w:r>
+            <w:proofErr w:type="spellEnd"/>
           </w:p>
         </w:tc>
         <w:tc>
@@ -1276,6 +3422,7 @@
                 <w:lang w:val="en-US"/>
               </w:rPr>
             </w:pPr>
+            <w:proofErr w:type="spellStart"/>
             <w:r>
               <w:rPr>
                 <w:b/>
@@ -1283,6 +3430,240 @@
                 <w:lang w:val="en-US"/>
               </w:rPr>
               <w:t>Tamanho</w:t>
+            </w:r>
+            <w:proofErr w:type="spellEnd"/>
+          </w:p>
+        </w:tc>
+        <w:tc>
+          <w:tcPr>
+            <w:tcW w:w="0" w:type="auto"/>
+            <w:tcBorders>
+              <w:top w:val="single" w:sz="6" w:space="0" w:color="909090"/>
+              <w:left w:val="single" w:sz="6" w:space="0" w:color="909090"/>
+              <w:bottom w:val="single" w:sz="6" w:space="0" w:color="909090"/>
+              <w:right w:val="single" w:sz="6" w:space="0" w:color="909090"/>
+            </w:tcBorders>
+            <w:shd w:val="clear" w:color="auto" w:fill="auto"/>
+            <w:tcMar>
+              <w:top w:w="45" w:type="dxa"/>
+              <w:left w:w="0" w:type="dxa"/>
+              <w:bottom w:w="45" w:type="dxa"/>
+              <w:right w:w="0" w:type="dxa"/>
+            </w:tcMar>
+            <w:hideMark/>
+          </w:tcPr>
+          <w:p>
+            <w:pPr>
+              <w:jc w:val="center"/>
+              <w:rPr>
+                <w:lang w:val="en-US"/>
+              </w:rPr>
+            </w:pPr>
+            <w:proofErr w:type="spellStart"/>
+            <w:r>
+              <w:rPr>
+                <w:b/>
+                <w:bCs/>
+                <w:lang w:val="en-US"/>
+              </w:rPr>
+              <w:t>Obrigatório</w:t>
+            </w:r>
+            <w:proofErr w:type="spellEnd"/>
+          </w:p>
+        </w:tc>
+        <w:tc>
+          <w:tcPr>
+            <w:tcW w:w="1823" w:type="dxa"/>
+            <w:tcBorders>
+              <w:top w:val="single" w:sz="6" w:space="0" w:color="909090"/>
+              <w:left w:val="single" w:sz="6" w:space="0" w:color="909090"/>
+              <w:bottom w:val="single" w:sz="6" w:space="0" w:color="909090"/>
+              <w:right w:val="single" w:sz="6" w:space="0" w:color="909090"/>
+            </w:tcBorders>
+            <w:shd w:val="clear" w:color="auto" w:fill="auto"/>
+            <w:tcMar>
+              <w:top w:w="45" w:type="dxa"/>
+              <w:left w:w="0" w:type="dxa"/>
+              <w:bottom w:w="45" w:type="dxa"/>
+              <w:right w:w="0" w:type="dxa"/>
+            </w:tcMar>
+            <w:hideMark/>
+          </w:tcPr>
+          <w:p>
+            <w:pPr>
+              <w:jc w:val="center"/>
+              <w:rPr>
+                <w:lang w:val="en-US"/>
+              </w:rPr>
+            </w:pPr>
+            <w:r>
+              <w:rPr>
+                <w:b/>
+                <w:bCs/>
+                <w:lang w:val="en-US"/>
+              </w:rPr>
+              <w:t xml:space="preserve">Chave </w:t>
+            </w:r>
+            <w:proofErr w:type="spellStart"/>
+            <w:r>
+              <w:rPr>
+                <w:b/>
+                <w:bCs/>
+                <w:lang w:val="en-US"/>
+              </w:rPr>
+              <w:t>Primária</w:t>
+            </w:r>
+            <w:proofErr w:type="spellEnd"/>
+          </w:p>
+        </w:tc>
+        <w:tc>
+          <w:tcPr>
+            <w:tcW w:w="2551" w:type="dxa"/>
+            <w:tcBorders>
+              <w:top w:val="single" w:sz="6" w:space="0" w:color="909090"/>
+              <w:left w:val="single" w:sz="6" w:space="0" w:color="909090"/>
+              <w:bottom w:val="single" w:sz="6" w:space="0" w:color="909090"/>
+              <w:right w:val="single" w:sz="6" w:space="0" w:color="909090"/>
+            </w:tcBorders>
+            <w:shd w:val="clear" w:color="auto" w:fill="auto"/>
+            <w:tcMar>
+              <w:top w:w="45" w:type="dxa"/>
+              <w:left w:w="0" w:type="dxa"/>
+              <w:bottom w:w="45" w:type="dxa"/>
+              <w:right w:w="0" w:type="dxa"/>
+            </w:tcMar>
+            <w:hideMark/>
+          </w:tcPr>
+          <w:p>
+            <w:pPr>
+              <w:jc w:val="center"/>
+              <w:rPr>
+                <w:lang w:val="en-US"/>
+              </w:rPr>
+            </w:pPr>
+            <w:proofErr w:type="spellStart"/>
+            <w:r>
+              <w:rPr>
+                <w:b/>
+                <w:bCs/>
+                <w:lang w:val="en-US"/>
+              </w:rPr>
+              <w:t>Observações</w:t>
+            </w:r>
+            <w:proofErr w:type="spellEnd"/>
+          </w:p>
+        </w:tc>
+      </w:tr>
+      <w:tr>
+        <w:tc>
+          <w:tcPr>
+            <w:tcW w:w="1135" w:type="dxa"/>
+            <w:tcBorders>
+              <w:top w:val="single" w:sz="6" w:space="0" w:color="909090"/>
+              <w:left w:val="single" w:sz="6" w:space="0" w:color="909090"/>
+              <w:bottom w:val="single" w:sz="6" w:space="0" w:color="909090"/>
+              <w:right w:val="single" w:sz="6" w:space="0" w:color="909090"/>
+            </w:tcBorders>
+            <w:shd w:val="clear" w:color="auto" w:fill="auto"/>
+            <w:tcMar>
+              <w:top w:w="45" w:type="dxa"/>
+              <w:left w:w="0" w:type="dxa"/>
+              <w:bottom w:w="45" w:type="dxa"/>
+              <w:right w:w="0" w:type="dxa"/>
+            </w:tcMar>
+            <w:hideMark/>
+          </w:tcPr>
+          <w:p>
+            <w:pPr>
+              <w:rPr>
+                <w:lang w:val="en-US"/>
+              </w:rPr>
+            </w:pPr>
+            <w:proofErr w:type="spellStart"/>
+            <w:r>
+              <w:rPr>
+                <w:lang w:val="en-US"/>
+              </w:rPr>
+              <w:t>Aluno</w:t>
+            </w:r>
+            <w:proofErr w:type="spellEnd"/>
+            <w:r>
+              <w:rPr>
+                <w:lang w:val="en-US"/>
+              </w:rPr>
+              <w:t> </w:t>
+            </w:r>
+          </w:p>
+        </w:tc>
+        <w:tc>
+          <w:tcPr>
+            <w:tcW w:w="1418" w:type="dxa"/>
+            <w:tcBorders>
+              <w:top w:val="single" w:sz="6" w:space="0" w:color="909090"/>
+              <w:left w:val="single" w:sz="6" w:space="0" w:color="909090"/>
+              <w:bottom w:val="single" w:sz="6" w:space="0" w:color="909090"/>
+              <w:right w:val="single" w:sz="6" w:space="0" w:color="909090"/>
+            </w:tcBorders>
+            <w:shd w:val="clear" w:color="auto" w:fill="auto"/>
+            <w:tcMar>
+              <w:top w:w="45" w:type="dxa"/>
+              <w:left w:w="0" w:type="dxa"/>
+              <w:bottom w:w="45" w:type="dxa"/>
+              <w:right w:w="0" w:type="dxa"/>
+            </w:tcMar>
+            <w:hideMark/>
+          </w:tcPr>
+          <w:p>
+            <w:pPr>
+              <w:rPr>
+                <w:lang w:val="en-US"/>
+              </w:rPr>
+            </w:pPr>
+            <w:proofErr w:type="spellStart"/>
+            <w:r>
+              <w:rPr>
+                <w:lang w:val="en-US"/>
+              </w:rPr>
+              <w:t>id_aluno</w:t>
+            </w:r>
+            <w:proofErr w:type="spellEnd"/>
+            <w:r>
+              <w:rPr>
+                <w:lang w:val="en-US"/>
+              </w:rPr>
+              <w:t> </w:t>
+            </w:r>
+          </w:p>
+        </w:tc>
+        <w:tc>
+          <w:tcPr>
+            <w:tcW w:w="1488" w:type="dxa"/>
+            <w:tcBorders>
+              <w:top w:val="single" w:sz="6" w:space="0" w:color="909090"/>
+              <w:left w:val="single" w:sz="6" w:space="0" w:color="909090"/>
+              <w:bottom w:val="single" w:sz="6" w:space="0" w:color="909090"/>
+              <w:right w:val="single" w:sz="6" w:space="0" w:color="909090"/>
+            </w:tcBorders>
+            <w:shd w:val="clear" w:color="auto" w:fill="auto"/>
+            <w:tcMar>
+              <w:top w:w="45" w:type="dxa"/>
+              <w:left w:w="0" w:type="dxa"/>
+              <w:bottom w:w="45" w:type="dxa"/>
+              <w:right w:w="0" w:type="dxa"/>
+            </w:tcMar>
+            <w:hideMark/>
+          </w:tcPr>
+          <w:p>
+            <w:pPr>
+              <w:rPr>
+                <w:lang w:val="en-US"/>
+              </w:rPr>
+            </w:pPr>
+            <w:r>
+              <w:rPr>
+                <w:lang w:val="en-US"/>
+              </w:rPr>
+              <w:t>INT </w:t>
             </w:r>
           </w:p>
         </w:tc>
@@ -1306,18 +3687,47 @@
           </w:tcPr>
           <w:p>
             <w:pPr>
-              <w:jc w:val="center"/>
               <w:rPr>
                 <w:lang w:val="en-US"/>
               </w:rPr>
             </w:pPr>
             <w:r>
               <w:rPr>
-                <w:b/>
-                <w:bCs/>
-                <w:lang w:val="en-US"/>
-              </w:rPr>
-              <w:t>Obrigatório</w:t>
+                <w:lang w:val="en-US"/>
+              </w:rPr>
+              <w:t>- </w:t>
+            </w:r>
+          </w:p>
+        </w:tc>
+        <w:tc>
+          <w:tcPr>
+            <w:tcW w:w="0" w:type="auto"/>
+            <w:tcBorders>
+              <w:top w:val="single" w:sz="6" w:space="0" w:color="909090"/>
+              <w:left w:val="single" w:sz="6" w:space="0" w:color="909090"/>
+              <w:bottom w:val="single" w:sz="6" w:space="0" w:color="909090"/>
+              <w:right w:val="single" w:sz="6" w:space="0" w:color="909090"/>
+            </w:tcBorders>
+            <w:shd w:val="clear" w:color="auto" w:fill="auto"/>
+            <w:tcMar>
+              <w:top w:w="45" w:type="dxa"/>
+              <w:left w:w="0" w:type="dxa"/>
+              <w:bottom w:w="45" w:type="dxa"/>
+              <w:right w:w="0" w:type="dxa"/>
+            </w:tcMar>
+            <w:hideMark/>
+          </w:tcPr>
+          <w:p>
+            <w:pPr>
+              <w:rPr>
+                <w:lang w:val="en-US"/>
+              </w:rPr>
+            </w:pPr>
+            <w:r>
+              <w:rPr>
+                <w:lang w:val="en-US"/>
+              </w:rPr>
+              <w:t>Sim </w:t>
             </w:r>
           </w:p>
         </w:tc>
@@ -1341,18 +3751,15 @@
           </w:tcPr>
           <w:p>
             <w:pPr>
-              <w:jc w:val="center"/>
               <w:rPr>
                 <w:lang w:val="en-US"/>
               </w:rPr>
             </w:pPr>
             <w:r>
               <w:rPr>
-                <w:b/>
-                <w:bCs/>
-                <w:lang w:val="en-US"/>
-              </w:rPr>
-              <w:t>Chave Primária</w:t>
+                <w:lang w:val="en-US"/>
+              </w:rPr>
+              <w:t>Sim </w:t>
             </w:r>
           </w:p>
         </w:tc>
@@ -1376,18 +3783,29 @@
           </w:tcPr>
           <w:p>
             <w:pPr>
-              <w:jc w:val="center"/>
               <w:rPr>
                 <w:lang w:val="en-US"/>
               </w:rPr>
             </w:pPr>
             <w:r>
               <w:rPr>
-                <w:b/>
-                <w:bCs/>
-                <w:lang w:val="en-US"/>
-              </w:rPr>
-              <w:t>Observações</w:t>
+                <w:lang w:val="en-US"/>
+              </w:rPr>
+              <w:t xml:space="preserve">Auto </w:t>
+            </w:r>
+            <w:proofErr w:type="spellStart"/>
+            <w:r>
+              <w:rPr>
+                <w:lang w:val="en-US"/>
+              </w:rPr>
+              <w:t>incremento</w:t>
+            </w:r>
+            <w:proofErr w:type="spellEnd"/>
+            <w:r>
+              <w:rPr>
+                <w:lang w:val="en-US"/>
+              </w:rPr>
+              <w:t> </w:t>
             </w:r>
           </w:p>
         </w:tc>
@@ -1417,11 +3835,19 @@
                 <w:lang w:val="en-US"/>
               </w:rPr>
             </w:pPr>
+            <w:proofErr w:type="spellStart"/>
             <w:r>
               <w:rPr>
                 <w:lang w:val="en-US"/>
               </w:rPr>
-              <w:t>Aluno </w:t>
+              <w:t>Aluno</w:t>
+            </w:r>
+            <w:proofErr w:type="spellEnd"/>
+            <w:r>
+              <w:rPr>
+                <w:lang w:val="en-US"/>
+              </w:rPr>
+              <w:t> </w:t>
             </w:r>
           </w:p>
         </w:tc>
@@ -1449,11 +3875,19 @@
                 <w:lang w:val="en-US"/>
               </w:rPr>
             </w:pPr>
+            <w:proofErr w:type="spellStart"/>
             <w:r>
               <w:rPr>
                 <w:lang w:val="en-US"/>
               </w:rPr>
-              <w:t>id_aluno </w:t>
+              <w:t>nome</w:t>
+            </w:r>
+            <w:proofErr w:type="spellEnd"/>
+            <w:r>
+              <w:rPr>
+                <w:lang w:val="en-US"/>
+              </w:rPr>
+              <w:t> </w:t>
             </w:r>
           </w:p>
         </w:tc>
@@ -1485,7 +3919,7 @@
               <w:rPr>
                 <w:lang w:val="en-US"/>
               </w:rPr>
-              <w:t>INT </w:t>
+              <w:t>VARCHAR </w:t>
             </w:r>
           </w:p>
         </w:tc>
@@ -1517,7 +3951,7 @@
               <w:rPr>
                 <w:lang w:val="en-US"/>
               </w:rPr>
-              <w:t>- </w:t>
+              <w:t>100 </w:t>
             </w:r>
           </w:p>
         </w:tc>
@@ -1577,11 +4011,19 @@
                 <w:lang w:val="en-US"/>
               </w:rPr>
             </w:pPr>
+            <w:proofErr w:type="spellStart"/>
             <w:r>
               <w:rPr>
                 <w:lang w:val="en-US"/>
               </w:rPr>
-              <w:t>Sim </w:t>
+              <w:t>Não</w:t>
+            </w:r>
+            <w:proofErr w:type="spellEnd"/>
+            <w:r>
+              <w:rPr>
+                <w:lang w:val="en-US"/>
+              </w:rPr>
+              <w:t> </w:t>
             </w:r>
           </w:p>
         </w:tc>
@@ -1611,232 +4053,6 @@
             </w:pPr>
             <w:r>
               <w:rPr>
-                <w:lang w:val="en-US"/>
-              </w:rPr>
-              <w:t>Auto incremento </w:t>
-            </w:r>
-          </w:p>
-        </w:tc>
-      </w:tr>
-      <w:tr>
-        <w:tc>
-          <w:tcPr>
-            <w:tcW w:w="1135" w:type="dxa"/>
-            <w:tcBorders>
-              <w:top w:val="single" w:sz="6" w:space="0" w:color="909090"/>
-              <w:left w:val="single" w:sz="6" w:space="0" w:color="909090"/>
-              <w:bottom w:val="single" w:sz="6" w:space="0" w:color="909090"/>
-              <w:right w:val="single" w:sz="6" w:space="0" w:color="909090"/>
-            </w:tcBorders>
-            <w:shd w:val="clear" w:color="auto" w:fill="auto"/>
-            <w:tcMar>
-              <w:top w:w="45" w:type="dxa"/>
-              <w:left w:w="0" w:type="dxa"/>
-              <w:bottom w:w="45" w:type="dxa"/>
-              <w:right w:w="0" w:type="dxa"/>
-            </w:tcMar>
-            <w:hideMark/>
-          </w:tcPr>
-          <w:p>
-            <w:pPr>
-              <w:rPr>
-                <w:lang w:val="en-US"/>
-              </w:rPr>
-            </w:pPr>
-            <w:r>
-              <w:rPr>
-                <w:lang w:val="en-US"/>
-              </w:rPr>
-              <w:t>Aluno </w:t>
-            </w:r>
-          </w:p>
-        </w:tc>
-        <w:tc>
-          <w:tcPr>
-            <w:tcW w:w="1418" w:type="dxa"/>
-            <w:tcBorders>
-              <w:top w:val="single" w:sz="6" w:space="0" w:color="909090"/>
-              <w:left w:val="single" w:sz="6" w:space="0" w:color="909090"/>
-              <w:bottom w:val="single" w:sz="6" w:space="0" w:color="909090"/>
-              <w:right w:val="single" w:sz="6" w:space="0" w:color="909090"/>
-            </w:tcBorders>
-            <w:shd w:val="clear" w:color="auto" w:fill="auto"/>
-            <w:tcMar>
-              <w:top w:w="45" w:type="dxa"/>
-              <w:left w:w="0" w:type="dxa"/>
-              <w:bottom w:w="45" w:type="dxa"/>
-              <w:right w:w="0" w:type="dxa"/>
-            </w:tcMar>
-            <w:hideMark/>
-          </w:tcPr>
-          <w:p>
-            <w:pPr>
-              <w:rPr>
-                <w:lang w:val="en-US"/>
-              </w:rPr>
-            </w:pPr>
-            <w:r>
-              <w:rPr>
-                <w:lang w:val="en-US"/>
-              </w:rPr>
-              <w:t>nome </w:t>
-            </w:r>
-          </w:p>
-        </w:tc>
-        <w:tc>
-          <w:tcPr>
-            <w:tcW w:w="1488" w:type="dxa"/>
-            <w:tcBorders>
-              <w:top w:val="single" w:sz="6" w:space="0" w:color="909090"/>
-              <w:left w:val="single" w:sz="6" w:space="0" w:color="909090"/>
-              <w:bottom w:val="single" w:sz="6" w:space="0" w:color="909090"/>
-              <w:right w:val="single" w:sz="6" w:space="0" w:color="909090"/>
-            </w:tcBorders>
-            <w:shd w:val="clear" w:color="auto" w:fill="auto"/>
-            <w:tcMar>
-              <w:top w:w="45" w:type="dxa"/>
-              <w:left w:w="0" w:type="dxa"/>
-              <w:bottom w:w="45" w:type="dxa"/>
-              <w:right w:w="0" w:type="dxa"/>
-            </w:tcMar>
-            <w:hideMark/>
-          </w:tcPr>
-          <w:p>
-            <w:pPr>
-              <w:rPr>
-                <w:lang w:val="en-US"/>
-              </w:rPr>
-            </w:pPr>
-            <w:r>
-              <w:rPr>
-                <w:lang w:val="en-US"/>
-              </w:rPr>
-              <w:t>VARCHAR </w:t>
-            </w:r>
-          </w:p>
-        </w:tc>
-        <w:tc>
-          <w:tcPr>
-            <w:tcW w:w="0" w:type="auto"/>
-            <w:tcBorders>
-              <w:top w:val="single" w:sz="6" w:space="0" w:color="909090"/>
-              <w:left w:val="single" w:sz="6" w:space="0" w:color="909090"/>
-              <w:bottom w:val="single" w:sz="6" w:space="0" w:color="909090"/>
-              <w:right w:val="single" w:sz="6" w:space="0" w:color="909090"/>
-            </w:tcBorders>
-            <w:shd w:val="clear" w:color="auto" w:fill="auto"/>
-            <w:tcMar>
-              <w:top w:w="45" w:type="dxa"/>
-              <w:left w:w="0" w:type="dxa"/>
-              <w:bottom w:w="45" w:type="dxa"/>
-              <w:right w:w="0" w:type="dxa"/>
-            </w:tcMar>
-            <w:hideMark/>
-          </w:tcPr>
-          <w:p>
-            <w:pPr>
-              <w:rPr>
-                <w:lang w:val="en-US"/>
-              </w:rPr>
-            </w:pPr>
-            <w:r>
-              <w:rPr>
-                <w:lang w:val="en-US"/>
-              </w:rPr>
-              <w:t>100 </w:t>
-            </w:r>
-          </w:p>
-        </w:tc>
-        <w:tc>
-          <w:tcPr>
-            <w:tcW w:w="0" w:type="auto"/>
-            <w:tcBorders>
-              <w:top w:val="single" w:sz="6" w:space="0" w:color="909090"/>
-              <w:left w:val="single" w:sz="6" w:space="0" w:color="909090"/>
-              <w:bottom w:val="single" w:sz="6" w:space="0" w:color="909090"/>
-              <w:right w:val="single" w:sz="6" w:space="0" w:color="909090"/>
-            </w:tcBorders>
-            <w:shd w:val="clear" w:color="auto" w:fill="auto"/>
-            <w:tcMar>
-              <w:top w:w="45" w:type="dxa"/>
-              <w:left w:w="0" w:type="dxa"/>
-              <w:bottom w:w="45" w:type="dxa"/>
-              <w:right w:w="0" w:type="dxa"/>
-            </w:tcMar>
-            <w:hideMark/>
-          </w:tcPr>
-          <w:p>
-            <w:pPr>
-              <w:rPr>
-                <w:lang w:val="en-US"/>
-              </w:rPr>
-            </w:pPr>
-            <w:r>
-              <w:rPr>
-                <w:lang w:val="en-US"/>
-              </w:rPr>
-              <w:t>Sim </w:t>
-            </w:r>
-          </w:p>
-        </w:tc>
-        <w:tc>
-          <w:tcPr>
-            <w:tcW w:w="1823" w:type="dxa"/>
-            <w:tcBorders>
-              <w:top w:val="single" w:sz="6" w:space="0" w:color="909090"/>
-              <w:left w:val="single" w:sz="6" w:space="0" w:color="909090"/>
-              <w:bottom w:val="single" w:sz="6" w:space="0" w:color="909090"/>
-              <w:right w:val="single" w:sz="6" w:space="0" w:color="909090"/>
-            </w:tcBorders>
-            <w:shd w:val="clear" w:color="auto" w:fill="auto"/>
-            <w:tcMar>
-              <w:top w:w="45" w:type="dxa"/>
-              <w:left w:w="0" w:type="dxa"/>
-              <w:bottom w:w="45" w:type="dxa"/>
-              <w:right w:w="0" w:type="dxa"/>
-            </w:tcMar>
-            <w:hideMark/>
-          </w:tcPr>
-          <w:p>
-            <w:pPr>
-              <w:rPr>
-                <w:lang w:val="en-US"/>
-              </w:rPr>
-            </w:pPr>
-            <w:r>
-              <w:rPr>
-                <w:lang w:val="en-US"/>
-              </w:rPr>
-              <w:t>Não </w:t>
-            </w:r>
-          </w:p>
-        </w:tc>
-        <w:tc>
-          <w:tcPr>
-            <w:tcW w:w="2551" w:type="dxa"/>
-            <w:tcBorders>
-              <w:top w:val="single" w:sz="6" w:space="0" w:color="909090"/>
-              <w:left w:val="single" w:sz="6" w:space="0" w:color="909090"/>
-              <w:bottom w:val="single" w:sz="6" w:space="0" w:color="909090"/>
-              <w:right w:val="single" w:sz="6" w:space="0" w:color="909090"/>
-            </w:tcBorders>
-            <w:shd w:val="clear" w:color="auto" w:fill="auto"/>
-            <w:tcMar>
-              <w:top w:w="45" w:type="dxa"/>
-              <w:left w:w="0" w:type="dxa"/>
-              <w:bottom w:w="45" w:type="dxa"/>
-              <w:right w:w="0" w:type="dxa"/>
-            </w:tcMar>
-            <w:hideMark/>
-          </w:tcPr>
-          <w:p>
-            <w:pPr>
-              <w:rPr>
-                <w:lang w:val="en-US"/>
-              </w:rPr>
-            </w:pPr>
-            <w:r>
-              <w:rPr>
                 <w:rFonts w:ascii="Arial" w:hAnsi="Arial" w:cs="Arial"/>
                 <w:lang w:val="en-US"/>
               </w:rPr>
@@ -1852,7 +4068,21 @@
               <w:rPr>
                 <w:lang w:val="en-US"/>
               </w:rPr>
-              <w:t xml:space="preserve">Nome Completo </w:t>
+              <w:t xml:space="preserve">Nome </w:t>
+            </w:r>
+            <w:proofErr w:type="spellStart"/>
+            <w:r>
+              <w:rPr>
+                <w:lang w:val="en-US"/>
+              </w:rPr>
+              <w:t>Completo</w:t>
+            </w:r>
+            <w:proofErr w:type="spellEnd"/>
+            <w:r>
+              <w:rPr>
+                <w:lang w:val="en-US"/>
+              </w:rPr>
+              <w:t xml:space="preserve"> </w:t>
             </w:r>
           </w:p>
         </w:tc>
@@ -1884,11 +4114,19 @@
                 <w:lang w:val="en-US"/>
               </w:rPr>
             </w:pPr>
+            <w:proofErr w:type="spellStart"/>
             <w:r>
               <w:rPr>
                 <w:lang w:val="en-US"/>
               </w:rPr>
-              <w:t>Aluno </w:t>
+              <w:t>Aluno</w:t>
+            </w:r>
+            <w:proofErr w:type="spellEnd"/>
+            <w:r>
+              <w:rPr>
+                <w:lang w:val="en-US"/>
+              </w:rPr>
+              <w:t> </w:t>
             </w:r>
           </w:p>
         </w:tc>
@@ -2039,12 +4277,14 @@
                 <w:lang w:val="en-US"/>
               </w:rPr>
             </w:pPr>
+            <w:proofErr w:type="spellStart"/>
             <w:r>
               <w:rPr>
                 <w:lang w:val="en-US"/>
               </w:rPr>
               <w:t>Não</w:t>
             </w:r>
+            <w:proofErr w:type="spellEnd"/>
           </w:p>
         </w:tc>
         <w:tc>
@@ -2076,15 +4316,33 @@
                 <w:rFonts w:ascii="Arial" w:hAnsi="Arial" w:cs="Arial"/>
                 <w:lang w:val="en-US"/>
               </w:rPr>
-              <w:t>Pontos e dígito</w:t>
+              <w:t xml:space="preserve">Pontos e </w:t>
             </w:r>
+            <w:proofErr w:type="spellStart"/>
             <w:r>
               <w:rPr>
                 <w:rFonts w:ascii="Arial" w:hAnsi="Arial" w:cs="Arial"/>
                 <w:lang w:val="en-US"/>
               </w:rPr>
-              <w:t xml:space="preserve"> verificador</w:t>
+              <w:t>dígito</w:t>
             </w:r>
+            <w:proofErr w:type="spellEnd"/>
+            <w:r>
+              <w:rPr>
+                <w:rFonts w:ascii="Arial" w:hAnsi="Arial" w:cs="Arial"/>
+                <w:lang w:val="en-US"/>
+              </w:rPr>
+              <w:t xml:space="preserve"> </w:t>
+            </w:r>
+            <w:proofErr w:type="spellStart"/>
+            <w:r>
+              <w:rPr>
+                <w:rFonts w:ascii="Arial" w:hAnsi="Arial" w:cs="Arial"/>
+                <w:lang w:val="en-US"/>
+              </w:rPr>
+              <w:t>verificador</w:t>
+            </w:r>
+            <w:proofErr w:type="spellEnd"/>
           </w:p>
         </w:tc>
       </w:tr>
@@ -2115,11 +4373,19 @@
                 <w:lang w:val="en-US"/>
               </w:rPr>
             </w:pPr>
+            <w:proofErr w:type="spellStart"/>
             <w:r>
               <w:rPr>
                 <w:lang w:val="en-US"/>
               </w:rPr>
-              <w:t>Aluno </w:t>
+              <w:t>Aluno</w:t>
+            </w:r>
+            <w:proofErr w:type="spellEnd"/>
+            <w:r>
+              <w:rPr>
+                <w:lang w:val="en-US"/>
+              </w:rPr>
+              <w:t> </w:t>
             </w:r>
           </w:p>
         </w:tc>
@@ -2277,12 +4543,14 @@
                 <w:lang w:val="en-US"/>
               </w:rPr>
             </w:pPr>
+            <w:proofErr w:type="spellStart"/>
             <w:r>
               <w:rPr>
                 <w:lang w:val="en-US"/>
               </w:rPr>
               <w:t>Não</w:t>
             </w:r>
+            <w:proofErr w:type="spellEnd"/>
           </w:p>
         </w:tc>
         <w:tc>
@@ -2314,7 +4582,23 @@
                 <w:rFonts w:ascii="Arial" w:hAnsi="Arial" w:cs="Arial"/>
                 <w:lang w:val="en-US"/>
               </w:rPr>
-              <w:t>Exige a presença do @</w:t>
+              <w:t xml:space="preserve">Exige a </w:t>
+            </w:r>
+            <w:proofErr w:type="spellStart"/>
+            <w:r>
+              <w:rPr>
+                <w:rFonts w:ascii="Arial" w:hAnsi="Arial" w:cs="Arial"/>
+                <w:lang w:val="en-US"/>
+              </w:rPr>
+              <w:t>presença</w:t>
+            </w:r>
+            <w:proofErr w:type="spellEnd"/>
+            <w:r>
+              <w:rPr>
+                <w:rFonts w:ascii="Arial" w:hAnsi="Arial" w:cs="Arial"/>
+                <w:lang w:val="en-US"/>
+              </w:rPr>
+              <w:t xml:space="preserve"> do @</w:t>
             </w:r>
           </w:p>
         </w:tc>
@@ -2343,12 +4627,14 @@
                 <w:lang w:val="en-US"/>
               </w:rPr>
             </w:pPr>
+            <w:proofErr w:type="spellStart"/>
             <w:r>
               <w:rPr>
                 <w:lang w:val="en-US"/>
               </w:rPr>
               <w:t>Aluno</w:t>
             </w:r>
+            <w:proofErr w:type="spellEnd"/>
           </w:p>
         </w:tc>
         <w:tc>
@@ -2374,12 +4660,14 @@
                 <w:lang w:val="en-US"/>
               </w:rPr>
             </w:pPr>
+            <w:proofErr w:type="spellStart"/>
             <w:r>
               <w:rPr>
                 <w:lang w:val="en-US"/>
               </w:rPr>
               <w:t>Telefone</w:t>
             </w:r>
+            <w:proofErr w:type="spellEnd"/>
           </w:p>
         </w:tc>
         <w:tc>
@@ -2503,12 +4791,14 @@
                 <w:lang w:val="en-US"/>
               </w:rPr>
             </w:pPr>
+            <w:proofErr w:type="spellStart"/>
             <w:r>
               <w:rPr>
                 <w:lang w:val="en-US"/>
               </w:rPr>
               <w:t>Não</w:t>
             </w:r>
+            <w:proofErr w:type="spellEnd"/>
           </w:p>
         </w:tc>
         <w:tc>
@@ -3283,6 +5573,155 @@
     </w:lvl>
   </w:abstractNum>
   <w:abstractNum w:abstractNumId="6" w15:restartNumberingAfterBreak="0">
+    <w:nsid w:val="63D12812"/>
+    <w:multiLevelType w:val="multilevel"/>
+    <w:tmpl w:val="D9C261D4"/>
+    <w:lvl w:ilvl="0">
+      <w:start w:val="1"/>
+      <w:numFmt w:val="bullet"/>
+      <w:lvlText w:val=""/>
+      <w:lvlJc w:val="left"/>
+      <w:pPr>
+        <w:tabs>
+          <w:tab w:val="num" w:pos="720"/>
+        </w:tabs>
+        <w:ind w:left="720" w:hanging="360"/>
+      </w:pPr>
+      <w:rPr>
+        <w:rFonts w:ascii="Symbol" w:hAnsi="Symbol" w:hint="default"/>
+        <w:sz w:val="20"/>
+      </w:rPr>
+    </w:lvl>
+    <w:lvl w:ilvl="1" w:tentative="1">
+      <w:start w:val="1"/>
+      <w:numFmt w:val="bullet"/>
+      <w:lvlText w:val="o"/>
+      <w:lvlJc w:val="left"/>
+      <w:pPr>
+        <w:tabs>
+          <w:tab w:val="num" w:pos="1440"/>
+        </w:tabs>
+        <w:ind w:left="1440" w:hanging="360"/>
+      </w:pPr>
+      <w:rPr>
+        <w:rFonts w:ascii="Courier New" w:hAnsi="Courier New" w:hint="default"/>
+        <w:sz w:val="20"/>
+      </w:rPr>
+    </w:lvl>
+    <w:lvl w:ilvl="2" w:tentative="1">
+      <w:start w:val="1"/>
+      <w:numFmt w:val="bullet"/>
+      <w:lvlText w:val=""/>
+      <w:lvlJc w:val="left"/>
+      <w:pPr>
+        <w:tabs>
+          <w:tab w:val="num" w:pos="2160"/>
+        </w:tabs>
+        <w:ind w:left="2160" w:hanging="360"/>
+      </w:pPr>
+      <w:rPr>
+        <w:rFonts w:ascii="Wingdings" w:hAnsi="Wingdings" w:hint="default"/>
+        <w:sz w:val="20"/>
+      </w:rPr>
+    </w:lvl>
+    <w:lvl w:ilvl="3" w:tentative="1">
+      <w:start w:val="1"/>
+      <w:numFmt w:val="bullet"/>
+      <w:lvlText w:val=""/>
+      <w:lvlJc w:val="left"/>
+      <w:pPr>
+        <w:tabs>
+          <w:tab w:val="num" w:pos="2880"/>
+        </w:tabs>
+        <w:ind w:left="2880" w:hanging="360"/>
+      </w:pPr>
+      <w:rPr>
+        <w:rFonts w:ascii="Wingdings" w:hAnsi="Wingdings" w:hint="default"/>
+        <w:sz w:val="20"/>
+      </w:rPr>
+    </w:lvl>
+    <w:lvl w:ilvl="4" w:tentative="1">
+      <w:start w:val="1"/>
+      <w:numFmt w:val="bullet"/>
+      <w:lvlText w:val=""/>
+      <w:lvlJc w:val="left"/>
+      <w:pPr>
+        <w:tabs>
+          <w:tab w:val="num" w:pos="3600"/>
+        </w:tabs>
+        <w:ind w:left="3600" w:hanging="360"/>
+      </w:pPr>
+      <w:rPr>
+        <w:rFonts w:ascii="Wingdings" w:hAnsi="Wingdings" w:hint="default"/>
+        <w:sz w:val="20"/>
+      </w:rPr>
+    </w:lvl>
+    <w:lvl w:ilvl="5" w:tentative="1">
+      <w:start w:val="1"/>
+      <w:numFmt w:val="bullet"/>
+      <w:lvlText w:val=""/>
+      <w:lvlJc w:val="left"/>
+      <w:pPr>
+        <w:tabs>
+          <w:tab w:val="num" w:pos="4320"/>
+        </w:tabs>
+        <w:ind w:left="4320" w:hanging="360"/>
+      </w:pPr>
+      <w:rPr>
+        <w:rFonts w:ascii="Wingdings" w:hAnsi="Wingdings" w:hint="default"/>
+        <w:sz w:val="20"/>
+      </w:rPr>
+    </w:lvl>
+    <w:lvl w:ilvl="6" w:tentative="1">
+      <w:start w:val="1"/>
+      <w:numFmt w:val="bullet"/>
+      <w:lvlText w:val=""/>
+      <w:lvlJc w:val="left"/>
+      <w:pPr>
+        <w:tabs>
+          <w:tab w:val="num" w:pos="5040"/>
+        </w:tabs>
+        <w:ind w:left="5040" w:hanging="360"/>
+      </w:pPr>
+      <w:rPr>
+        <w:rFonts w:ascii="Wingdings" w:hAnsi="Wingdings" w:hint="default"/>
+        <w:sz w:val="20"/>
+      </w:rPr>
+    </w:lvl>
+    <w:lvl w:ilvl="7" w:tentative="1">
+      <w:start w:val="1"/>
+      <w:numFmt w:val="bullet"/>
+      <w:lvlText w:val=""/>
+      <w:lvlJc w:val="left"/>
+      <w:pPr>
+        <w:tabs>
+          <w:tab w:val="num" w:pos="5760"/>
+        </w:tabs>
+        <w:ind w:left="5760" w:hanging="360"/>
+      </w:pPr>
+      <w:rPr>
+        <w:rFonts w:ascii="Wingdings" w:hAnsi="Wingdings" w:hint="default"/>
+        <w:sz w:val="20"/>
+      </w:rPr>
+    </w:lvl>
+    <w:lvl w:ilvl="8" w:tentative="1">
+      <w:start w:val="1"/>
+      <w:numFmt w:val="bullet"/>
+      <w:lvlText w:val=""/>
+      <w:lvlJc w:val="left"/>
+      <w:pPr>
+        <w:tabs>
+          <w:tab w:val="num" w:pos="6480"/>
+        </w:tabs>
+        <w:ind w:left="6480" w:hanging="360"/>
+      </w:pPr>
+      <w:rPr>
+        <w:rFonts w:ascii="Wingdings" w:hAnsi="Wingdings" w:hint="default"/>
+        <w:sz w:val="20"/>
+      </w:rPr>
+    </w:lvl>
+  </w:abstractNum>
+  <w:abstractNum w:abstractNumId="7" w15:restartNumberingAfterBreak="0">
     <w:nsid w:val="6B224B12"/>
     <w:multiLevelType w:val="hybridMultilevel"/>
     <w:tmpl w:val="557ABEBE"/>
@@ -3405,7 +5844,7 @@
     <w:abstractNumId w:val="3"/>
   </w:num>
   <w:num w:numId="4" w16cid:durableId="588121197">
-    <w:abstractNumId w:val="6"/>
+    <w:abstractNumId w:val="7"/>
   </w:num>
   <w:num w:numId="5" w16cid:durableId="2117217003">
     <w:abstractNumId w:val="2"/>
@@ -3415,6 +5854,9 @@
   </w:num>
   <w:num w:numId="7" w16cid:durableId="139156002">
     <w:abstractNumId w:val="5"/>
+  </w:num>
+  <w:num w:numId="8" w16cid:durableId="916980409">
+    <w:abstractNumId w:val="6"/>
   </w:num>
 </w:numbering>
 </file>
@@ -4022,7 +6464,6 @@
   <w:style w:type="character" w:default="1" w:styleId="Fontepargpadro">
     <w:name w:val="Default Paragraph Font"/>
     <w:uiPriority w:val="1"/>
-    <w:semiHidden/>
     <w:unhideWhenUsed/>
   </w:style>
   <w:style w:type="table" w:default="1" w:styleId="Tabelanormal">

</xml_diff>